<commit_message>
docs: focus repository notes on week7 features and verification
</commit_message>
<xml_diff>
--- a/廖子豪2024142009AI协作日志W7.docx
+++ b/廖子豪2024142009AI协作日志W7.docx
@@ -9,8 +9,6 @@
           <w:lang w:eastAsia="zh-CN"/>
         </w:rPr>
       </w:pPr>
-      <w:bookmarkStart w:id="0" w:name="_GoBack"/>
-      <w:bookmarkEnd w:id="0"/>
       <w:r>
         <w:rPr>
           <w:rFonts w:hint="eastAsia"/>
@@ -35,72 +33,54 @@
         <w:rPr>
           <w:rFonts w:hint="eastAsia"/>
         </w:rPr>
-        <w:t>文件命名</w:t>
-      </w:r>
-      <w:r>
+        <w:t>姓名： 廖子豪</w:t>
+      </w:r>
+    </w:p>
+    <w:p>
+      <w:pPr>
         <w:rPr>
           <w:rFonts w:hint="eastAsia"/>
-          <w:lang w:eastAsia="zh-CN"/>
-        </w:rPr>
-        <w:t>：</w:t>
-      </w:r>
+        </w:rPr>
+      </w:pPr>
       <w:r>
         <w:rPr>
           <w:rFonts w:hint="eastAsia"/>
         </w:rPr>
-        <w:t>[姓名][学号]AI协作日志W</w:t>
+        <w:t>学号： 2024142009</w:t>
+      </w:r>
+    </w:p>
+    <w:p>
+      <w:pPr>
+        <w:rPr>
+          <w:rFonts w:hint="default" w:eastAsia="宋体"/>
+          <w:lang w:val="en-US" w:eastAsia="zh-CN"/>
+        </w:rPr>
+      </w:pPr>
+      <w:r>
+        <w:rPr>
+          <w:rFonts w:hint="eastAsia"/>
+        </w:rPr>
+        <w:t xml:space="preserve">使用的AI工具及方式： </w:t>
       </w:r>
       <w:r>
         <w:rPr>
           <w:rFonts w:hint="eastAsia"/>
           <w:lang w:val="en-US" w:eastAsia="zh-CN"/>
         </w:rPr>
-        <w:t>7</w:t>
+        <w:t xml:space="preserve">ChatGPT &amp; </w:t>
       </w:r>
       <w:r>
         <w:rPr>
           <w:rFonts w:hint="eastAsia"/>
         </w:rPr>
-        <w:t>.docx</w:t>
-      </w:r>
-    </w:p>
-    <w:p>
-      <w:pPr>
+        <w:t>Codex</w:t>
+      </w:r>
+      <w:r>
         <w:rPr>
           <w:rFonts w:hint="eastAsia"/>
-        </w:rPr>
-      </w:pPr>
-      <w:r>
-        <w:rPr>
-          <w:rFonts w:hint="eastAsia"/>
-        </w:rPr>
-        <w:t>姓名： 廖子豪</w:t>
-      </w:r>
-    </w:p>
-    <w:p>
-      <w:pPr>
-        <w:rPr>
-          <w:rFonts w:hint="eastAsia"/>
-        </w:rPr>
-      </w:pPr>
-      <w:r>
-        <w:rPr>
-          <w:rFonts w:hint="eastAsia"/>
-        </w:rPr>
-        <w:t>学号： 2024142009</w:t>
-      </w:r>
-    </w:p>
-    <w:p>
-      <w:pPr>
-        <w:rPr>
-          <w:rFonts w:hint="eastAsia"/>
-        </w:rPr>
-      </w:pPr>
-      <w:r>
-        <w:rPr>
-          <w:rFonts w:hint="eastAsia"/>
-        </w:rPr>
-        <w:t>使用的AI工具及方式： Codex（生成、代码审查、浏览器自动验证及报告整理）</w:t>
+          <w:lang w:val="en-US" w:eastAsia="zh-CN"/>
+        </w:rPr>
+        <w:t xml:space="preserve"> 6-Astra high</w:t>
       </w:r>
     </w:p>
     <w:p>
@@ -330,8 +310,14 @@
           <w:rFonts w:ascii="Calibri" w:hAnsi="Calibri" w:eastAsia="宋体"/>
           <w:sz w:val="21"/>
         </w:rPr>
-        <w:br/>
-        <w:t xml:space="preserve">本次类型：AI 生成、AI 调试。</w:t>
+        <w:br w:type="textWrapping"/>
+      </w:r>
+      <w:r>
+        <w:rPr>
+          <w:rFonts w:ascii="Calibri" w:hAnsi="Calibri" w:eastAsia="宋体"/>
+          <w:sz w:val="21"/>
+        </w:rPr>
+        <w:t>本次类型：AI 生成、AI 调试。</w:t>
       </w:r>
     </w:p>
     <w:p>
@@ -370,8 +356,14 @@
           <w:rFonts w:ascii="Calibri" w:hAnsi="Calibri" w:eastAsia="宋体"/>
           <w:sz w:val="21"/>
         </w:rPr>
-        <w:br/>
-        <w:t xml:space="preserve">本次对应函数：addTodo / removeTodo / toggleTodo / render。</w:t>
+        <w:br w:type="textWrapping"/>
+      </w:r>
+      <w:r>
+        <w:rPr>
+          <w:rFonts w:ascii="Calibri" w:hAnsi="Calibri" w:eastAsia="宋体"/>
+          <w:sz w:val="21"/>
+        </w:rPr>
+        <w:t>本次对应函数：addTodo / removeTodo / toggleTodo / render。</w:t>
       </w:r>
     </w:p>
     <w:p>
@@ -407,17 +399,28 @@
     </w:p>
     <w:p>
       <w:pPr>
-        <w:rPr>
-          <w:rFonts w:hint="eastAsia"/>
-        </w:rPr>
-      </w:pPr>
-      <w:r>
-        <w:rPr>
-          <w:rFonts w:ascii="Calibri" w:hAnsi="Calibri" w:eastAsia="宋体"/>
-          <w:sz w:val="21"/>
-        </w:rPr>
-        <w:t xml:space="preserve">执行需求（依据本次总体要求与 Plan 整理）：请在 W6 页面上把 Todo 改成由 todos 数组驱动，完成添加、删除和完成切换。使用原生 JS，保留原页面；添加用展开、删除用 filter、切换用 map 加对象展开，不能 push/splice 或直接改旧对象。三个操作都按更新数据→save()→render() 执行；列表仅由 render 创建，任务文字用 textContent；删除不能顺带切换完成状态，并验证键盘操作。</w:t>
-      </w:r>
+        <w:ind w:firstLine="420" w:firstLineChars="200"/>
+        <w:rPr>
+          <w:rFonts w:ascii="Calibri" w:hAnsi="Calibri" w:eastAsia="宋体"/>
+          <w:sz w:val="21"/>
+        </w:rPr>
+      </w:pPr>
+      <w:r>
+        <w:rPr>
+          <w:rFonts w:ascii="Calibri" w:hAnsi="Calibri" w:eastAsia="宋体"/>
+          <w:sz w:val="21"/>
+        </w:rPr>
+        <w:t>请在 W6 页面上把 Todo 改成由 todos 数组驱动，完成添加、删除和完成切换。使用原生 JS，保留原页面；添加用展开、删除用 filter、切换用 map 加对象展开，不能 push/splice 或直接改旧对象。三个操作都按更新数据→save()→render() 执行；列表仅由 render 创建，任务文字用 textContent；删除不能顺带切换完成状态，并验证键盘操作。</w:t>
+      </w:r>
+    </w:p>
+    <w:p>
+      <w:pPr>
+        <w:ind w:firstLine="420" w:firstLineChars="200"/>
+        <w:rPr>
+          <w:rFonts w:hint="eastAsia" w:ascii="Calibri" w:hAnsi="Calibri" w:eastAsia="宋体"/>
+          <w:sz w:val="21"/>
+        </w:rPr>
+      </w:pPr>
     </w:p>
     <w:p>
       <w:pPr>
@@ -466,70 +469,428 @@
     <w:p>
       <w:pPr>
         <w:spacing w:before="0" w:after="40"/>
-      </w:pPr>
-      <w:r>
-        <w:rPr>
-          <w:rFonts w:ascii="Calibri" w:hAnsi="Calibri" w:eastAsia="宋体"/>
-          <w:sz w:val="21"/>
-        </w:rPr>
-        <w:t xml:space="preserve">// 初版核心片段，完整留档：evidence/script.phase1.js</w:t>
-        <w:br/>
-        <w:t xml:space="preserve">function addTodo(text) {</w:t>
-        <w:br/>
+        <w:rPr>
+          <w:rFonts w:ascii="Calibri" w:hAnsi="Calibri" w:eastAsia="宋体"/>
+          <w:sz w:val="21"/>
+        </w:rPr>
+      </w:pPr>
+      <w:r>
+        <w:rPr>
+          <w:rFonts w:ascii="Calibri" w:hAnsi="Calibri" w:eastAsia="宋体"/>
+          <w:sz w:val="21"/>
+        </w:rPr>
+        <w:t>// 初版核心片段，完整留档：evidence/script.phase1.js</w:t>
+      </w:r>
+      <w:r>
+        <w:rPr>
+          <w:rFonts w:ascii="Calibri" w:hAnsi="Calibri" w:eastAsia="宋体"/>
+          <w:sz w:val="21"/>
+        </w:rPr>
+        <w:br w:type="textWrapping"/>
+      </w:r>
+      <w:r>
+        <w:rPr>
+          <w:rFonts w:ascii="Calibri" w:hAnsi="Calibri" w:eastAsia="宋体"/>
+          <w:sz w:val="21"/>
+        </w:rPr>
+        <w:t>function addTodo(text) {</w:t>
+      </w:r>
+      <w:r>
+        <w:rPr>
+          <w:rFonts w:ascii="Calibri" w:hAnsi="Calibri" w:eastAsia="宋体"/>
+          <w:sz w:val="21"/>
+        </w:rPr>
+        <w:br w:type="textWrapping"/>
+      </w:r>
+      <w:r>
+        <w:rPr>
+          <w:rFonts w:ascii="Calibri" w:hAnsi="Calibri" w:eastAsia="宋体"/>
+          <w:sz w:val="21"/>
+        </w:rPr>
         <w:t xml:space="preserve">  const cleaned = text.trim();</w:t>
-        <w:br/>
+      </w:r>
+      <w:r>
+        <w:rPr>
+          <w:rFonts w:ascii="Calibri" w:hAnsi="Calibri" w:eastAsia="宋体"/>
+          <w:sz w:val="21"/>
+        </w:rPr>
+        <w:br w:type="textWrapping"/>
+      </w:r>
+      <w:r>
+        <w:rPr>
+          <w:rFonts w:ascii="Calibri" w:hAnsi="Calibri" w:eastAsia="宋体"/>
+          <w:sz w:val="21"/>
+        </w:rPr>
         <w:t xml:space="preserve">  if (!cleaned) return;</w:t>
-        <w:br/>
+      </w:r>
+      <w:r>
+        <w:rPr>
+          <w:rFonts w:ascii="Calibri" w:hAnsi="Calibri" w:eastAsia="宋体"/>
+          <w:sz w:val="21"/>
+        </w:rPr>
+        <w:br w:type="textWrapping"/>
+      </w:r>
+      <w:r>
+        <w:rPr>
+          <w:rFonts w:ascii="Calibri" w:hAnsi="Calibri" w:eastAsia="宋体"/>
+          <w:sz w:val="21"/>
+        </w:rPr>
         <w:t xml:space="preserve">  todos = [...todos, { id: crypto.randomUUID(),</w:t>
-        <w:br/>
+      </w:r>
+      <w:r>
+        <w:rPr>
+          <w:rFonts w:ascii="Calibri" w:hAnsi="Calibri" w:eastAsia="宋体"/>
+          <w:sz w:val="21"/>
+        </w:rPr>
+        <w:br w:type="textWrapping"/>
+      </w:r>
+      <w:r>
+        <w:rPr>
+          <w:rFonts w:ascii="Calibri" w:hAnsi="Calibri" w:eastAsia="宋体"/>
+          <w:sz w:val="21"/>
+        </w:rPr>
         <w:t xml:space="preserve">    text: cleaned, completed: false }];</w:t>
-        <w:br/>
+      </w:r>
+      <w:r>
+        <w:rPr>
+          <w:rFonts w:ascii="Calibri" w:hAnsi="Calibri" w:eastAsia="宋体"/>
+          <w:sz w:val="21"/>
+        </w:rPr>
+        <w:br w:type="textWrapping"/>
+      </w:r>
+      <w:r>
+        <w:rPr>
+          <w:rFonts w:ascii="Calibri" w:hAnsi="Calibri" w:eastAsia="宋体"/>
+          <w:sz w:val="21"/>
+        </w:rPr>
         <w:t xml:space="preserve">  save(); render();</w:t>
-        <w:br/>
-        <w:t xml:space="preserve">}</w:t>
-        <w:br/>
-        <w:t xml:space="preserve">function removeTodo(id) {</w:t>
-        <w:br/>
+      </w:r>
+      <w:r>
+        <w:rPr>
+          <w:rFonts w:ascii="Calibri" w:hAnsi="Calibri" w:eastAsia="宋体"/>
+          <w:sz w:val="21"/>
+        </w:rPr>
+        <w:br w:type="textWrapping"/>
+      </w:r>
+      <w:r>
+        <w:rPr>
+          <w:rFonts w:ascii="Calibri" w:hAnsi="Calibri" w:eastAsia="宋体"/>
+          <w:sz w:val="21"/>
+        </w:rPr>
+        <w:t>}</w:t>
+      </w:r>
+      <w:r>
+        <w:rPr>
+          <w:rFonts w:ascii="Calibri" w:hAnsi="Calibri" w:eastAsia="宋体"/>
+          <w:sz w:val="21"/>
+        </w:rPr>
+        <w:br w:type="textWrapping"/>
+      </w:r>
+      <w:r>
+        <w:rPr>
+          <w:rFonts w:ascii="Calibri" w:hAnsi="Calibri" w:eastAsia="宋体"/>
+          <w:sz w:val="21"/>
+        </w:rPr>
+        <w:t>function removeTodo(id) {</w:t>
+      </w:r>
+      <w:r>
+        <w:rPr>
+          <w:rFonts w:ascii="Calibri" w:hAnsi="Calibri" w:eastAsia="宋体"/>
+          <w:sz w:val="21"/>
+        </w:rPr>
+        <w:br w:type="textWrapping"/>
+      </w:r>
+      <w:r>
+        <w:rPr>
+          <w:rFonts w:ascii="Calibri" w:hAnsi="Calibri" w:eastAsia="宋体"/>
+          <w:sz w:val="21"/>
+        </w:rPr>
         <w:t xml:space="preserve">  todos = todos.filter(t =&gt; t.id !== id);</w:t>
-        <w:br/>
+      </w:r>
+      <w:r>
+        <w:rPr>
+          <w:rFonts w:ascii="Calibri" w:hAnsi="Calibri" w:eastAsia="宋体"/>
+          <w:sz w:val="21"/>
+        </w:rPr>
+        <w:br w:type="textWrapping"/>
+      </w:r>
+      <w:r>
+        <w:rPr>
+          <w:rFonts w:ascii="Calibri" w:hAnsi="Calibri" w:eastAsia="宋体"/>
+          <w:sz w:val="21"/>
+        </w:rPr>
         <w:t xml:space="preserve">  save(); render();</w:t>
-        <w:br/>
-        <w:t xml:space="preserve">}</w:t>
-        <w:br/>
-        <w:t xml:space="preserve">function toggleTodo(id) {</w:t>
-        <w:br/>
+      </w:r>
+      <w:r>
+        <w:rPr>
+          <w:rFonts w:ascii="Calibri" w:hAnsi="Calibri" w:eastAsia="宋体"/>
+          <w:sz w:val="21"/>
+        </w:rPr>
+        <w:br w:type="textWrapping"/>
+      </w:r>
+      <w:r>
+        <w:rPr>
+          <w:rFonts w:ascii="Calibri" w:hAnsi="Calibri" w:eastAsia="宋体"/>
+          <w:sz w:val="21"/>
+        </w:rPr>
+        <w:t>}</w:t>
+      </w:r>
+      <w:r>
+        <w:rPr>
+          <w:rFonts w:ascii="Calibri" w:hAnsi="Calibri" w:eastAsia="宋体"/>
+          <w:sz w:val="21"/>
+        </w:rPr>
+        <w:br w:type="textWrapping"/>
+      </w:r>
+      <w:r>
+        <w:rPr>
+          <w:rFonts w:ascii="Calibri" w:hAnsi="Calibri" w:eastAsia="宋体"/>
+          <w:sz w:val="21"/>
+        </w:rPr>
+        <w:t>function toggleTodo(id) {</w:t>
+      </w:r>
+      <w:r>
+        <w:rPr>
+          <w:rFonts w:ascii="Calibri" w:hAnsi="Calibri" w:eastAsia="宋体"/>
+          <w:sz w:val="21"/>
+        </w:rPr>
+        <w:br w:type="textWrapping"/>
+      </w:r>
+      <w:r>
+        <w:rPr>
+          <w:rFonts w:ascii="Calibri" w:hAnsi="Calibri" w:eastAsia="宋体"/>
+          <w:sz w:val="21"/>
+        </w:rPr>
         <w:t xml:space="preserve">  todos = todos.map(t =&gt; t.id === id</w:t>
-        <w:br/>
+      </w:r>
+      <w:r>
+        <w:rPr>
+          <w:rFonts w:ascii="Calibri" w:hAnsi="Calibri" w:eastAsia="宋体"/>
+          <w:sz w:val="21"/>
+        </w:rPr>
+        <w:br w:type="textWrapping"/>
+      </w:r>
+      <w:r>
+        <w:rPr>
+          <w:rFonts w:ascii="Calibri" w:hAnsi="Calibri" w:eastAsia="宋体"/>
+          <w:sz w:val="21"/>
+        </w:rPr>
         <w:t xml:space="preserve">    ? { ...t, completed: !t.completed } : t);</w:t>
-        <w:br/>
+      </w:r>
+      <w:r>
+        <w:rPr>
+          <w:rFonts w:ascii="Calibri" w:hAnsi="Calibri" w:eastAsia="宋体"/>
+          <w:sz w:val="21"/>
+        </w:rPr>
+        <w:br w:type="textWrapping"/>
+      </w:r>
+      <w:r>
+        <w:rPr>
+          <w:rFonts w:ascii="Calibri" w:hAnsi="Calibri" w:eastAsia="宋体"/>
+          <w:sz w:val="21"/>
+        </w:rPr>
         <w:t xml:space="preserve">  save(); render();</w:t>
-        <w:br/>
-        <w:t xml:space="preserve">}</w:t>
-        <w:br/>
-        <w:t xml:space="preserve">// render 初版节选：每次重建列表，没有保存和恢复焦点。</w:t>
-        <w:br/>
-        <w:t xml:space="preserve">list.replaceChildren();</w:t>
-        <w:br/>
-        <w:t xml:space="preserve">todos.forEach(({ id, text, completed }) =&gt; {</w:t>
-        <w:br/>
+      </w:r>
+      <w:r>
+        <w:rPr>
+          <w:rFonts w:ascii="Calibri" w:hAnsi="Calibri" w:eastAsia="宋体"/>
+          <w:sz w:val="21"/>
+        </w:rPr>
+        <w:br w:type="textWrapping"/>
+      </w:r>
+      <w:r>
+        <w:rPr>
+          <w:rFonts w:ascii="Calibri" w:hAnsi="Calibri" w:eastAsia="宋体"/>
+          <w:sz w:val="21"/>
+        </w:rPr>
+        <w:t>}</w:t>
+      </w:r>
+    </w:p>
+    <w:p>
+      <w:pPr>
+        <w:spacing w:before="0" w:after="40"/>
+        <w:rPr>
+          <w:rFonts w:ascii="Calibri" w:hAnsi="Calibri" w:eastAsia="宋体"/>
+          <w:sz w:val="21"/>
+        </w:rPr>
+      </w:pPr>
+      <w:r>
+        <w:rPr>
+          <w:rFonts w:ascii="Calibri" w:hAnsi="Calibri" w:eastAsia="宋体"/>
+          <w:sz w:val="21"/>
+        </w:rPr>
+        <w:br w:type="textWrapping"/>
+      </w:r>
+      <w:r>
+        <w:rPr>
+          <w:rFonts w:ascii="Calibri" w:hAnsi="Calibri" w:eastAsia="宋体"/>
+          <w:sz w:val="21"/>
+        </w:rPr>
+        <w:t>// render 初版节选：每次重建列表，没有保存和恢复焦点。</w:t>
+      </w:r>
+      <w:r>
+        <w:rPr>
+          <w:rFonts w:ascii="Calibri" w:hAnsi="Calibri" w:eastAsia="宋体"/>
+          <w:sz w:val="21"/>
+        </w:rPr>
+        <w:br w:type="textWrapping"/>
+      </w:r>
+      <w:r>
+        <w:rPr>
+          <w:rFonts w:ascii="Calibri" w:hAnsi="Calibri" w:eastAsia="宋体"/>
+          <w:sz w:val="21"/>
+        </w:rPr>
+        <w:t>list.replaceChildren();</w:t>
+      </w:r>
+      <w:r>
+        <w:rPr>
+          <w:rFonts w:ascii="Calibri" w:hAnsi="Calibri" w:eastAsia="宋体"/>
+          <w:sz w:val="21"/>
+        </w:rPr>
+        <w:br w:type="textWrapping"/>
+      </w:r>
+      <w:r>
+        <w:rPr>
+          <w:rFonts w:ascii="Calibri" w:hAnsi="Calibri" w:eastAsia="宋体"/>
+          <w:sz w:val="21"/>
+        </w:rPr>
+        <w:t>todos.forEach(({ id, text, completed }) =&gt; {</w:t>
+      </w:r>
+      <w:r>
+        <w:rPr>
+          <w:rFonts w:ascii="Calibri" w:hAnsi="Calibri" w:eastAsia="宋体"/>
+          <w:sz w:val="21"/>
+        </w:rPr>
+        <w:br w:type="textWrapping"/>
+      </w:r>
+      <w:r>
+        <w:rPr>
+          <w:rFonts w:ascii="Calibri" w:hAnsi="Calibri" w:eastAsia="宋体"/>
+          <w:sz w:val="21"/>
+        </w:rPr>
         <w:t xml:space="preserve">  const li = document.createElement("li");</w:t>
-        <w:br/>
+      </w:r>
+      <w:r>
+        <w:rPr>
+          <w:rFonts w:ascii="Calibri" w:hAnsi="Calibri" w:eastAsia="宋体"/>
+          <w:sz w:val="21"/>
+        </w:rPr>
+        <w:br w:type="textWrapping"/>
+      </w:r>
+      <w:r>
+        <w:rPr>
+          <w:rFonts w:ascii="Calibri" w:hAnsi="Calibri" w:eastAsia="宋体"/>
+          <w:sz w:val="21"/>
+        </w:rPr>
         <w:t xml:space="preserve">  const toggle = document.createElement("button");</w:t>
-        <w:br/>
+      </w:r>
+      <w:r>
+        <w:rPr>
+          <w:rFonts w:ascii="Calibri" w:hAnsi="Calibri" w:eastAsia="宋体"/>
+          <w:sz w:val="21"/>
+        </w:rPr>
+        <w:br w:type="textWrapping"/>
+      </w:r>
+      <w:r>
+        <w:rPr>
+          <w:rFonts w:ascii="Calibri" w:hAnsi="Calibri" w:eastAsia="宋体"/>
+          <w:sz w:val="21"/>
+        </w:rPr>
         <w:t xml:space="preserve">  toggle.type = "button";</w:t>
-        <w:br/>
+      </w:r>
+      <w:r>
+        <w:rPr>
+          <w:rFonts w:ascii="Calibri" w:hAnsi="Calibri" w:eastAsia="宋体"/>
+          <w:sz w:val="21"/>
+        </w:rPr>
+        <w:br w:type="textWrapping"/>
+      </w:r>
+      <w:r>
+        <w:rPr>
+          <w:rFonts w:ascii="Calibri" w:hAnsi="Calibri" w:eastAsia="宋体"/>
+          <w:sz w:val="21"/>
+        </w:rPr>
         <w:t xml:space="preserve">  toggle.textContent = text;</w:t>
-        <w:br/>
+      </w:r>
+      <w:r>
+        <w:rPr>
+          <w:rFonts w:ascii="Calibri" w:hAnsi="Calibri" w:eastAsia="宋体"/>
+          <w:sz w:val="21"/>
+        </w:rPr>
+        <w:br w:type="textWrapping"/>
+      </w:r>
+      <w:r>
+        <w:rPr>
+          <w:rFonts w:ascii="Calibri" w:hAnsi="Calibri" w:eastAsia="宋体"/>
+          <w:sz w:val="21"/>
+        </w:rPr>
         <w:t xml:space="preserve">  li.addEventListener("click", () =&gt; toggleTodo(id));</w:t>
-        <w:br/>
+      </w:r>
+      <w:r>
+        <w:rPr>
+          <w:rFonts w:ascii="Calibri" w:hAnsi="Calibri" w:eastAsia="宋体"/>
+          <w:sz w:val="21"/>
+        </w:rPr>
+        <w:br w:type="textWrapping"/>
+      </w:r>
+      <w:r>
+        <w:rPr>
+          <w:rFonts w:ascii="Calibri" w:hAnsi="Calibri" w:eastAsia="宋体"/>
+          <w:sz w:val="21"/>
+        </w:rPr>
         <w:t xml:space="preserve">  // 删除按钮的处理器先 stopPropagation，再 removeTodo(id)。</w:t>
-        <w:br/>
+      </w:r>
+      <w:r>
+        <w:rPr>
+          <w:rFonts w:ascii="Calibri" w:hAnsi="Calibri" w:eastAsia="宋体"/>
+          <w:sz w:val="21"/>
+        </w:rPr>
+        <w:br w:type="textWrapping"/>
+      </w:r>
+      <w:r>
+        <w:rPr>
+          <w:rFonts w:ascii="Calibri" w:hAnsi="Calibri" w:eastAsia="宋体"/>
+          <w:sz w:val="21"/>
+        </w:rPr>
         <w:t xml:space="preserve">  li.append(toggle, delBtn);</w:t>
-        <w:br/>
+      </w:r>
+      <w:r>
+        <w:rPr>
+          <w:rFonts w:ascii="Calibri" w:hAnsi="Calibri" w:eastAsia="宋体"/>
+          <w:sz w:val="21"/>
+        </w:rPr>
+        <w:br w:type="textWrapping"/>
+      </w:r>
+      <w:r>
+        <w:rPr>
+          <w:rFonts w:ascii="Calibri" w:hAnsi="Calibri" w:eastAsia="宋体"/>
+          <w:sz w:val="21"/>
+        </w:rPr>
         <w:t xml:space="preserve">  list.appendChild(li);</w:t>
-        <w:br/>
-        <w:t xml:space="preserve">});</w:t>
-      </w:r>
+      </w:r>
+      <w:r>
+        <w:rPr>
+          <w:rFonts w:ascii="Calibri" w:hAnsi="Calibri" w:eastAsia="宋体"/>
+          <w:sz w:val="21"/>
+        </w:rPr>
+        <w:br w:type="textWrapping"/>
+      </w:r>
+      <w:r>
+        <w:rPr>
+          <w:rFonts w:ascii="Calibri" w:hAnsi="Calibri" w:eastAsia="宋体"/>
+          <w:sz w:val="21"/>
+        </w:rPr>
+        <w:t>});</w:t>
+      </w:r>
+    </w:p>
+    <w:p>
+      <w:pPr>
+        <w:spacing w:before="0" w:after="40"/>
+        <w:rPr>
+          <w:rFonts w:ascii="Calibri" w:hAnsi="Calibri" w:eastAsia="宋体"/>
+          <w:sz w:val="21"/>
+        </w:rPr>
+      </w:pPr>
     </w:p>
     <w:p>
       <w:pPr>
@@ -568,14 +929,29 @@
     <w:p>
       <w:pPr>
         <w:spacing w:before="0" w:after="40"/>
-      </w:pPr>
-      <w:r>
-        <w:rPr>
-          <w:rFonts w:ascii="Calibri" w:hAnsi="Calibri" w:eastAsia="宋体"/>
-          <w:sz w:val="21"/>
-        </w:rPr>
-        <w:t xml:space="preserve">AI 辅助审查结论：三个函数已生成新数组，toggle 也没有修改旧对象；但 render 整表重建会销毁正在聚焦的按钮。实际按 Enter 切换任务后，completed 变成 true，document.activeElement 却变成 BODY，连续键盘操作失去原位置。问题在 DOM 重建与焦点管理，不在不可变更新本身。上方 render 为相关语句节选，delBtn 创建过程省略，不能单独运行。</w:t>
-      </w:r>
+        <w:ind w:firstLine="420" w:firstLineChars="200"/>
+        <w:rPr>
+          <w:rFonts w:ascii="Calibri" w:hAnsi="Calibri" w:eastAsia="宋体"/>
+          <w:sz w:val="21"/>
+        </w:rPr>
+      </w:pPr>
+      <w:r>
+        <w:rPr>
+          <w:rFonts w:ascii="Calibri" w:hAnsi="Calibri" w:eastAsia="宋体"/>
+          <w:sz w:val="21"/>
+        </w:rPr>
+        <w:t>AI 辅助审查结论：三个函数已生成新数组，toggle 也没有修改旧对象；但 render 整表重建会销毁正在聚焦的按钮。实际按 Enter 切换任务后，completed 变成 true，document.activeElement 却变成 BODY，连续键盘操作失去原位置。问题在 DOM 重建与焦点管理，不在不可变更新本身。上方 render 为相关语句节选，delBtn 创建过程省略，不能单独运行。</w:t>
+      </w:r>
+    </w:p>
+    <w:p>
+      <w:pPr>
+        <w:spacing w:before="0" w:after="40"/>
+        <w:ind w:firstLine="420" w:firstLineChars="200"/>
+        <w:rPr>
+          <w:rFonts w:ascii="Calibri" w:hAnsi="Calibri" w:eastAsia="宋体"/>
+          <w:sz w:val="21"/>
+        </w:rPr>
+      </w:pPr>
     </w:p>
     <w:p>
       <w:pPr>
@@ -710,14 +1086,36 @@
     <w:p>
       <w:pPr>
         <w:spacing w:before="0" w:after="40"/>
-      </w:pPr>
-      <w:r>
-        <w:rPr>
-          <w:rFonts w:ascii="Calibri" w:hAnsi="Calibri" w:eastAsia="宋体"/>
-          <w:sz w:val="21"/>
-        </w:rPr>
-        <w:t xml:space="preserve">判断类型：发现可改进项，修改后接受。修改 render：重画前记录当前焦点所在任务的 id 和按钮类型；挂载后按 id 找到新按钮并 focus。如果删除或筛选导致该任务不再显示，则回到输入框。保留 filter/map/展开更新、删除阻止冒泡和 textContent。没有为了凑审查记录把正确的不可变写法改坏。</w:t>
-      </w:r>
+        <w:rPr>
+          <w:rFonts w:ascii="Calibri" w:hAnsi="Calibri" w:eastAsia="宋体"/>
+          <w:sz w:val="21"/>
+        </w:rPr>
+      </w:pPr>
+      <w:r>
+        <w:rPr>
+          <w:rFonts w:ascii="Calibri" w:hAnsi="Calibri" w:eastAsia="宋体"/>
+          <w:sz w:val="21"/>
+        </w:rPr>
+        <w:t>判断类型：发现可改进项，修改后接受。修改 render：重画前记录当前焦点所在任务的 id 和按钮类型；挂载后按 id 找到新按钮并 focus。如果删除或筛选导致该任务不再显示，则回到输入框。保留 filter/map/展开更新、删除阻止冒泡和 textContent。没有为了凑审查记录把正确的不可变写法改坏。</w:t>
+      </w:r>
+    </w:p>
+    <w:p>
+      <w:pPr>
+        <w:spacing w:before="0" w:after="40"/>
+        <w:rPr>
+          <w:rFonts w:ascii="Calibri" w:hAnsi="Calibri" w:eastAsia="宋体"/>
+          <w:sz w:val="21"/>
+        </w:rPr>
+      </w:pPr>
+    </w:p>
+    <w:p>
+      <w:pPr>
+        <w:spacing w:before="0" w:after="40"/>
+        <w:rPr>
+          <w:rFonts w:ascii="Calibri" w:hAnsi="Calibri" w:eastAsia="宋体"/>
+          <w:sz w:val="21"/>
+        </w:rPr>
+      </w:pPr>
     </w:p>
     <w:p>
       <w:pPr>
@@ -789,8 +1187,14 @@
           <w:rFonts w:ascii="Calibri" w:hAnsi="Calibri" w:eastAsia="宋体"/>
           <w:sz w:val="21"/>
         </w:rPr>
-        <w:br/>
-        <w:t xml:space="preserve">本次实际验证：Codex 在本机 Chrome 打开页面，添加一项、聚焦任务按钮并按 Enter；同一流程分别运行初版与修订版，记录 activeElement 和 completed。再用冻结旧数组/对象的方式检查三种更新。</w:t>
+        <w:br w:type="textWrapping"/>
+      </w:r>
+      <w:r>
+        <w:rPr>
+          <w:rFonts w:ascii="Calibri" w:hAnsi="Calibri" w:eastAsia="宋体"/>
+          <w:sz w:val="21"/>
+        </w:rPr>
+        <w:t>本次实际验证：Codex 在本机 Chrome 打开页面，添加一项、聚焦任务按钮并按 Enter；同一流程分别运行初版与修订版，记录 activeElement 和 completed。再用冻结旧数组/对象的方式检查三种更新。</w:t>
       </w:r>
     </w:p>
     <w:p>
@@ -838,8 +1242,142 @@
           <w:rFonts w:ascii="Calibri" w:hAnsi="Calibri" w:eastAsia="宋体"/>
           <w:sz w:val="21"/>
         </w:rPr>
-        <w:br/>
-        <w:t xml:space="preserve">初版焦点为 BODY、completed=true；修订版焦点为 BUTTON（todo-toggle）、completed=true。最终回归中 add/remove/toggle 的旧数组均保持，toggle 只创建目标的新对象；筛选内任务消失时焦点回输入框。结果见 review-before.json、review-after.json、results.json。</w:t>
+        <w:br w:type="textWrapping"/>
+      </w:r>
+      <w:r>
+        <w:rPr>
+          <w:rFonts w:ascii="Calibri" w:hAnsi="Calibri" w:eastAsia="宋体"/>
+          <w:sz w:val="21"/>
+        </w:rPr>
+        <w:t>初版焦点为 BODY、completed=true；修订版焦点为 BUTTON（todo-toggle）、completed=true。最终回归中 add/remove/toggle 的旧数组均保持，toggle 只创建目标的新对象；筛选内任务消失时焦点回输入框。结果见 review-before.json、review-after.json、results.json。</w:t>
+      </w:r>
+    </w:p>
+    <w:p>
+      <w:pPr>
+        <w:keepNext/>
+        <w:keepLines/>
+        <w:spacing w:before="80" w:after="80" w:line="240" w:lineRule="auto"/>
+        <w:ind w:firstLine="0"/>
+        <w:jc w:val="center"/>
+      </w:pPr>
+      <w:r>
+        <w:drawing>
+          <wp:inline distT="0" distB="0" distL="114300" distR="114300">
+            <wp:extent cx="3686175" cy="1103630"/>
+            <wp:effectExtent l="0" t="0" r="22225" b="13970"/>
+            <wp:docPr id="1" name="Week7 evidence 1" descr="图 1  修复前：任务已完成，键盘焦点丢失，无任务按钮焦点轮廓。"/>
+            <wp:cNvGraphicFramePr>
+              <a:graphicFrameLocks xmlns:a="http://schemas.openxmlformats.org/drawingml/2006/main" noChangeAspect="1"/>
+            </wp:cNvGraphicFramePr>
+            <a:graphic xmlns:a="http://schemas.openxmlformats.org/drawingml/2006/main">
+              <a:graphicData uri="http://schemas.openxmlformats.org/drawingml/2006/picture">
+                <pic:pic xmlns:pic="http://schemas.openxmlformats.org/drawingml/2006/picture">
+                  <pic:nvPicPr>
+                    <pic:cNvPr id="1" name="Week7 evidence 1" descr="图 1  修复前：任务已完成，键盘焦点丢失，无任务按钮焦点轮廓。"/>
+                    <pic:cNvPicPr>
+                      <a:picLocks noChangeAspect="1"/>
+                    </pic:cNvPicPr>
+                  </pic:nvPicPr>
+                  <pic:blipFill>
+                    <a:blip r:embed="rId6"/>
+                    <a:stretch>
+                      <a:fillRect/>
+                    </a:stretch>
+                  </pic:blipFill>
+                  <pic:spPr>
+                    <a:xfrm>
+                      <a:off x="0" y="0"/>
+                      <a:ext cx="3686175" cy="1103630"/>
+                    </a:xfrm>
+                    <a:prstGeom prst="rect">
+                      <a:avLst/>
+                    </a:prstGeom>
+                  </pic:spPr>
+                </pic:pic>
+              </a:graphicData>
+            </a:graphic>
+          </wp:inline>
+        </w:drawing>
+      </w:r>
+    </w:p>
+    <w:p>
+      <w:pPr>
+        <w:keepNext/>
+        <w:keepLines/>
+        <w:spacing w:before="80" w:after="80" w:line="240" w:lineRule="auto"/>
+        <w:ind w:firstLine="0"/>
+        <w:jc w:val="center"/>
+      </w:pPr>
+      <w:r>
+        <w:rPr>
+          <w:rFonts w:ascii="Times New Roman" w:hAnsi="Times New Roman" w:eastAsia="宋体"/>
+          <w:sz w:val="18"/>
+        </w:rPr>
+        <w:t>图 1  修复前：任务已完成，键盘焦点丢失，无任务按钮焦点轮廓。</w:t>
+      </w:r>
+    </w:p>
+    <w:p>
+      <w:pPr>
+        <w:keepNext/>
+        <w:keepLines/>
+        <w:spacing w:before="80" w:after="80" w:line="240" w:lineRule="auto"/>
+        <w:ind w:firstLine="0"/>
+        <w:jc w:val="center"/>
+      </w:pPr>
+      <w:r>
+        <w:drawing>
+          <wp:inline distT="0" distB="0" distL="114300" distR="114300">
+            <wp:extent cx="3740785" cy="1119505"/>
+            <wp:effectExtent l="0" t="0" r="18415" b="23495"/>
+            <wp:docPr id="2" name="Week7 evidence 2" descr="图 2  修复后：重绘完成，焦点回到原任务按钮，显示焦点轮廓。"/>
+            <wp:cNvGraphicFramePr>
+              <a:graphicFrameLocks xmlns:a="http://schemas.openxmlformats.org/drawingml/2006/main" noChangeAspect="1"/>
+            </wp:cNvGraphicFramePr>
+            <a:graphic xmlns:a="http://schemas.openxmlformats.org/drawingml/2006/main">
+              <a:graphicData uri="http://schemas.openxmlformats.org/drawingml/2006/picture">
+                <pic:pic xmlns:pic="http://schemas.openxmlformats.org/drawingml/2006/picture">
+                  <pic:nvPicPr>
+                    <pic:cNvPr id="2" name="Week7 evidence 2" descr="图 2  修复后：重绘完成，焦点回到原任务按钮，显示焦点轮廓。"/>
+                    <pic:cNvPicPr>
+                      <a:picLocks noChangeAspect="1"/>
+                    </pic:cNvPicPr>
+                  </pic:nvPicPr>
+                  <pic:blipFill>
+                    <a:blip r:embed="rId7"/>
+                    <a:stretch>
+                      <a:fillRect/>
+                    </a:stretch>
+                  </pic:blipFill>
+                  <pic:spPr>
+                    <a:xfrm>
+                      <a:off x="0" y="0"/>
+                      <a:ext cx="3740785" cy="1119505"/>
+                    </a:xfrm>
+                    <a:prstGeom prst="rect">
+                      <a:avLst/>
+                    </a:prstGeom>
+                  </pic:spPr>
+                </pic:pic>
+              </a:graphicData>
+            </a:graphic>
+          </wp:inline>
+        </w:drawing>
+      </w:r>
+    </w:p>
+    <w:p>
+      <w:pPr>
+        <w:keepNext w:val="0"/>
+        <w:keepLines/>
+        <w:spacing w:before="80" w:after="80" w:line="240" w:lineRule="auto"/>
+        <w:ind w:firstLine="0"/>
+        <w:jc w:val="center"/>
+      </w:pPr>
+      <w:r>
+        <w:rPr>
+          <w:rFonts w:ascii="Times New Roman" w:hAnsi="Times New Roman" w:eastAsia="宋体"/>
+          <w:sz w:val="18"/>
+        </w:rPr>
+        <w:t>图 2  修复后：重绘完成，焦点回到原任务按钮，显示焦点轮廓。</w:t>
       </w:r>
     </w:p>
     <w:p>
@@ -920,8 +1458,14 @@
           <w:rFonts w:ascii="Calibri" w:hAnsi="Calibri" w:eastAsia="宋体"/>
           <w:sz w:val="21"/>
         </w:rPr>
-        <w:br/>
-        <w:t xml:space="preserve">是。对照复现证明焦点丢失来自替换旧节点；恢复焦点后任务状态与键盘位置同时正确。</w:t>
+        <w:br w:type="textWrapping"/>
+      </w:r>
+      <w:r>
+        <w:rPr>
+          <w:rFonts w:ascii="Calibri" w:hAnsi="Calibri" w:eastAsia="宋体"/>
+          <w:sz w:val="21"/>
+        </w:rPr>
+        <w:t>是。对照复现证明焦点丢失来自替换旧节点；恢复焦点后任务状态与键盘位置同时正确。</w:t>
       </w:r>
     </w:p>
     <w:p>
@@ -964,23 +1508,29 @@
           <w:rFonts w:ascii="Calibri" w:hAnsi="Calibri" w:eastAsia="宋体"/>
           <w:sz w:val="21"/>
         </w:rPr>
-        <w:br/>
-        <w:t xml:space="preserve">列表状态正确不代表交互完整；重建 DOM 时还应考虑焦点等浏览器交互状态。</w:t>
+        <w:br w:type="textWrapping"/>
+      </w:r>
+      <w:r>
+        <w:rPr>
+          <w:rFonts w:ascii="Calibri" w:hAnsi="Calibri" w:eastAsia="宋体"/>
+          <w:sz w:val="21"/>
+        </w:rPr>
+        <w:t>列表状态正确不代表交互完整；重建 DOM 时还应考虑焦点等浏览器交互状态。</w:t>
       </w:r>
     </w:p>
     <w:p>
       <w:pPr>
         <w:spacing w:after="40"/>
         <w:rPr>
+          <w:rFonts w:hint="default"/>
+          <w:lang w:val="en-US" w:eastAsia="zh-CN"/>
+        </w:rPr>
+      </w:pPr>
+      <w:r>
+        <w:rPr>
           <w:rFonts w:hint="eastAsia"/>
           <w:lang w:val="en-US" w:eastAsia="zh-CN"/>
         </w:rPr>
-      </w:pPr>
-      <w:r>
-        <w:rPr>
-          <w:rFonts w:hint="eastAsia"/>
-          <w:lang w:val="en-US" w:eastAsia="zh-CN"/>
-        </w:rPr>
         <w:t>补充说明（可选）：</w:t>
       </w:r>
       <w:r>
@@ -988,18 +1538,8 @@
           <w:rFonts w:ascii="Calibri" w:hAnsi="Calibri" w:eastAsia="宋体"/>
           <w:sz w:val="21"/>
         </w:rPr>
-        <w:br/>
-        <w:t xml:space="preserve">本报告按实际工具日志整理；审查和测试由 Codex 辅助完成，不冒充学生已亲自执行。Prompt 为本次执行约束的整理，不是另一段未发生对话的逐字引用。</w:t>
-      </w:r>
-    </w:p>
-    <w:p>
-      <w:pPr>
-        <w:spacing w:after="40"/>
-        <w:rPr>
-          <w:rFonts w:hint="default"/>
-          <w:lang w:val="en-US" w:eastAsia="zh-CN"/>
-        </w:rPr>
-      </w:pPr>
+        <w:br w:type="textWrapping"/>
+      </w:r>
     </w:p>
     <w:p>
       <w:pPr>
@@ -1095,8 +1635,14 @@
           <w:rFonts w:ascii="Calibri" w:hAnsi="Calibri" w:eastAsia="宋体"/>
           <w:sz w:val="21"/>
         </w:rPr>
-        <w:br/>
-        <w:t xml:space="preserve">本次类型：AI 调试、AI 生成。</w:t>
+        <w:br w:type="textWrapping"/>
+      </w:r>
+      <w:r>
+        <w:rPr>
+          <w:rFonts w:ascii="Calibri" w:hAnsi="Calibri" w:eastAsia="宋体"/>
+          <w:sz w:val="21"/>
+        </w:rPr>
+        <w:t>本次类型：AI 调试、AI 生成。</w:t>
       </w:r>
     </w:p>
     <w:p>
@@ -1135,8 +1681,14 @@
           <w:rFonts w:ascii="Calibri" w:hAnsi="Calibri" w:eastAsia="宋体"/>
           <w:sz w:val="21"/>
         </w:rPr>
-        <w:br/>
-        <w:t xml:space="preserve">本次对应函数：load / save / setFilter / render。</w:t>
+        <w:br w:type="textWrapping"/>
+      </w:r>
+      <w:r>
+        <w:rPr>
+          <w:rFonts w:ascii="Calibri" w:hAnsi="Calibri" w:eastAsia="宋体"/>
+          <w:sz w:val="21"/>
+        </w:rPr>
+        <w:t>本次对应函数：load / save / setFilter / render。</w:t>
       </w:r>
     </w:p>
     <w:p>
@@ -1172,16 +1724,18 @@
     </w:p>
     <w:p>
       <w:pPr>
-        <w:rPr>
-          <w:rFonts w:hint="eastAsia"/>
-        </w:rPr>
-      </w:pPr>
-      <w:r>
-        <w:rPr>
-          <w:rFonts w:ascii="Calibri" w:hAnsi="Calibri" w:eastAsia="宋体"/>
-          <w:sz w:val="21"/>
-        </w:rPr>
-        <w:t xml:space="preserve">执行需求（依据本次总体要求与 Plan 整理）：为 Todo 完善本地存储和 all/done/active 筛选。用 JSON.stringify 保存、JSON.parse 读取，初始化先 load 再 render；坏 JSON、错误结构和存储不可用不能中断页面。筛选只影响显示，不能改 todos 或保存 filter，刷新回 all。检查删除和切换后的刷新结果，并验证存储失败时的提示。</w:t>
+        <w:ind w:firstLine="420" w:firstLineChars="200"/>
+        <w:rPr>
+          <w:rFonts w:hint="eastAsia" w:ascii="Calibri" w:hAnsi="Calibri" w:eastAsia="宋体"/>
+          <w:sz w:val="21"/>
+        </w:rPr>
+      </w:pPr>
+      <w:r>
+        <w:rPr>
+          <w:rFonts w:ascii="Calibri" w:hAnsi="Calibri" w:eastAsia="宋体"/>
+          <w:sz w:val="21"/>
+        </w:rPr>
+        <w:t>为 Todo 完善本地存储和 all/done/active 筛选。用 JSON.stringify 保存、JSON.parse 读取，初始化先 load 再 render；坏 JSON、错误结构和存储不可用不能中断页面。筛选只影响显示，不能改 todos 或保存 filter，刷新回 all。检查删除和切换后的刷新结果，并验证存储失败时的提示。</w:t>
       </w:r>
     </w:p>
     <w:p>
@@ -1231,44 +1785,246 @@
     <w:p>
       <w:pPr>
         <w:spacing w:before="0" w:after="40"/>
-      </w:pPr>
-      <w:r>
-        <w:rPr>
-          <w:rFonts w:ascii="Calibri" w:hAnsi="Calibri" w:eastAsia="宋体"/>
-          <w:sz w:val="21"/>
-        </w:rPr>
-        <w:t xml:space="preserve">// 第一阶段生成代码：正常 JSON 可用，异常路径尚未处理。</w:t>
-        <w:br/>
-        <w:t xml:space="preserve">function save() {</w:t>
-        <w:br/>
+        <w:rPr>
+          <w:rFonts w:ascii="Calibri" w:hAnsi="Calibri" w:eastAsia="宋体"/>
+          <w:sz w:val="21"/>
+        </w:rPr>
+      </w:pPr>
+      <w:r>
+        <w:rPr>
+          <w:rFonts w:ascii="Calibri" w:hAnsi="Calibri" w:eastAsia="宋体"/>
+          <w:sz w:val="21"/>
+        </w:rPr>
+        <w:t>// 第一阶段生成代码：正常 JSON 可用，异常路径尚未处理。</w:t>
+      </w:r>
+      <w:r>
+        <w:rPr>
+          <w:rFonts w:ascii="Calibri" w:hAnsi="Calibri" w:eastAsia="宋体"/>
+          <w:sz w:val="21"/>
+        </w:rPr>
+        <w:br w:type="textWrapping"/>
+      </w:r>
+      <w:r>
+        <w:rPr>
+          <w:rFonts w:ascii="Calibri" w:hAnsi="Calibri" w:eastAsia="宋体"/>
+          <w:sz w:val="21"/>
+        </w:rPr>
+        <w:t>function save() {</w:t>
+      </w:r>
+      <w:r>
+        <w:rPr>
+          <w:rFonts w:ascii="Calibri" w:hAnsi="Calibri" w:eastAsia="宋体"/>
+          <w:sz w:val="21"/>
+        </w:rPr>
+        <w:br w:type="textWrapping"/>
+      </w:r>
+      <w:r>
+        <w:rPr>
+          <w:rFonts w:ascii="Calibri" w:hAnsi="Calibri" w:eastAsia="宋体"/>
+          <w:sz w:val="21"/>
+        </w:rPr>
         <w:t xml:space="preserve">  localStorage.setItem(KEY, JSON.stringify(todos));</w:t>
-        <w:br/>
-        <w:t xml:space="preserve">}</w:t>
-        <w:br/>
-        <w:t xml:space="preserve">function load() {</w:t>
-        <w:br/>
+      </w:r>
+      <w:r>
+        <w:rPr>
+          <w:rFonts w:ascii="Calibri" w:hAnsi="Calibri" w:eastAsia="宋体"/>
+          <w:sz w:val="21"/>
+        </w:rPr>
+        <w:br w:type="textWrapping"/>
+      </w:r>
+      <w:r>
+        <w:rPr>
+          <w:rFonts w:ascii="Calibri" w:hAnsi="Calibri" w:eastAsia="宋体"/>
+          <w:sz w:val="21"/>
+        </w:rPr>
+        <w:t>}</w:t>
+      </w:r>
+      <w:r>
+        <w:rPr>
+          <w:rFonts w:ascii="Calibri" w:hAnsi="Calibri" w:eastAsia="宋体"/>
+          <w:sz w:val="21"/>
+        </w:rPr>
+        <w:br w:type="textWrapping"/>
+      </w:r>
+      <w:r>
+        <w:rPr>
+          <w:rFonts w:ascii="Calibri" w:hAnsi="Calibri" w:eastAsia="宋体"/>
+          <w:sz w:val="21"/>
+        </w:rPr>
+        <w:t>function load() {</w:t>
+      </w:r>
+      <w:r>
+        <w:rPr>
+          <w:rFonts w:ascii="Calibri" w:hAnsi="Calibri" w:eastAsia="宋体"/>
+          <w:sz w:val="21"/>
+        </w:rPr>
+        <w:br w:type="textWrapping"/>
+      </w:r>
+      <w:r>
+        <w:rPr>
+          <w:rFonts w:ascii="Calibri" w:hAnsi="Calibri" w:eastAsia="宋体"/>
+          <w:sz w:val="21"/>
+        </w:rPr>
         <w:t xml:space="preserve">  const raw = localStorage.getItem(KEY);</w:t>
-        <w:br/>
+      </w:r>
+      <w:r>
+        <w:rPr>
+          <w:rFonts w:ascii="Calibri" w:hAnsi="Calibri" w:eastAsia="宋体"/>
+          <w:sz w:val="21"/>
+        </w:rPr>
+        <w:br w:type="textWrapping"/>
+      </w:r>
+      <w:r>
+        <w:rPr>
+          <w:rFonts w:ascii="Calibri" w:hAnsi="Calibri" w:eastAsia="宋体"/>
+          <w:sz w:val="21"/>
+        </w:rPr>
         <w:t xml:space="preserve">  return raw === null ? [] : JSON.parse(raw);</w:t>
-        <w:br/>
-        <w:t xml:space="preserve">}</w:t>
-        <w:br/>
-        <w:t xml:space="preserve">// 后续新增的筛选核心：视图状态不写入存储。</w:t>
-        <w:br/>
-        <w:t xml:space="preserve">function setFilter(value) {</w:t>
-        <w:br/>
+      </w:r>
+      <w:r>
+        <w:rPr>
+          <w:rFonts w:ascii="Calibri" w:hAnsi="Calibri" w:eastAsia="宋体"/>
+          <w:sz w:val="21"/>
+        </w:rPr>
+        <w:br w:type="textWrapping"/>
+      </w:r>
+      <w:r>
+        <w:rPr>
+          <w:rFonts w:ascii="Calibri" w:hAnsi="Calibri" w:eastAsia="宋体"/>
+          <w:sz w:val="21"/>
+        </w:rPr>
+        <w:t>}</w:t>
+      </w:r>
+    </w:p>
+    <w:p>
+      <w:pPr>
+        <w:spacing w:before="0" w:after="40"/>
+        <w:rPr>
+          <w:rFonts w:ascii="Calibri" w:hAnsi="Calibri" w:eastAsia="宋体"/>
+          <w:sz w:val="21"/>
+        </w:rPr>
+      </w:pPr>
+      <w:r>
+        <w:rPr>
+          <w:rFonts w:ascii="Calibri" w:hAnsi="Calibri" w:eastAsia="宋体"/>
+          <w:sz w:val="21"/>
+        </w:rPr>
+        <w:br w:type="textWrapping"/>
+      </w:r>
+      <w:r>
+        <w:rPr>
+          <w:rFonts w:ascii="Calibri" w:hAnsi="Calibri" w:eastAsia="宋体"/>
+          <w:sz w:val="21"/>
+        </w:rPr>
+        <w:t>// 后续新增的筛选核心：视图状态不写入存储。</w:t>
+      </w:r>
+      <w:r>
+        <w:rPr>
+          <w:rFonts w:ascii="Calibri" w:hAnsi="Calibri" w:eastAsia="宋体"/>
+          <w:sz w:val="21"/>
+        </w:rPr>
+        <w:br w:type="textWrapping"/>
+      </w:r>
+      <w:r>
+        <w:rPr>
+          <w:rFonts w:ascii="Calibri" w:hAnsi="Calibri" w:eastAsia="宋体"/>
+          <w:sz w:val="21"/>
+        </w:rPr>
+        <w:t>function setFilter(value) {</w:t>
+      </w:r>
+      <w:r>
+        <w:rPr>
+          <w:rFonts w:ascii="Calibri" w:hAnsi="Calibri" w:eastAsia="宋体"/>
+          <w:sz w:val="21"/>
+        </w:rPr>
+        <w:br w:type="textWrapping"/>
+      </w:r>
+      <w:r>
+        <w:rPr>
+          <w:rFonts w:ascii="Calibri" w:hAnsi="Calibri" w:eastAsia="宋体"/>
+          <w:sz w:val="21"/>
+        </w:rPr>
         <w:t xml:space="preserve">  if (!["all", "done", "active"].includes(value)) return;</w:t>
-        <w:br/>
+      </w:r>
+      <w:r>
+        <w:rPr>
+          <w:rFonts w:ascii="Calibri" w:hAnsi="Calibri" w:eastAsia="宋体"/>
+          <w:sz w:val="21"/>
+        </w:rPr>
+        <w:br w:type="textWrapping"/>
+      </w:r>
+      <w:r>
+        <w:rPr>
+          <w:rFonts w:ascii="Calibri" w:hAnsi="Calibri" w:eastAsia="宋体"/>
+          <w:sz w:val="21"/>
+        </w:rPr>
         <w:t xml:space="preserve">  filter = value;</w:t>
-        <w:br/>
+      </w:r>
+      <w:r>
+        <w:rPr>
+          <w:rFonts w:ascii="Calibri" w:hAnsi="Calibri" w:eastAsia="宋体"/>
+          <w:sz w:val="21"/>
+        </w:rPr>
+        <w:br w:type="textWrapping"/>
+      </w:r>
+      <w:r>
+        <w:rPr>
+          <w:rFonts w:ascii="Calibri" w:hAnsi="Calibri" w:eastAsia="宋体"/>
+          <w:sz w:val="21"/>
+        </w:rPr>
         <w:t xml:space="preserve">  render();</w:t>
-        <w:br/>
-        <w:t xml:space="preserve">}</w:t>
-        <w:br/>
-        <w:t xml:space="preserve">const shown = todos.filter(t =&gt; filter === "all"</w:t>
-        <w:br/>
+      </w:r>
+      <w:r>
+        <w:rPr>
+          <w:rFonts w:ascii="Calibri" w:hAnsi="Calibri" w:eastAsia="宋体"/>
+          <w:sz w:val="21"/>
+        </w:rPr>
+        <w:br w:type="textWrapping"/>
+      </w:r>
+      <w:r>
+        <w:rPr>
+          <w:rFonts w:ascii="Calibri" w:hAnsi="Calibri" w:eastAsia="宋体"/>
+          <w:sz w:val="21"/>
+        </w:rPr>
+        <w:t>}</w:t>
+      </w:r>
+      <w:r>
+        <w:rPr>
+          <w:rFonts w:ascii="Calibri" w:hAnsi="Calibri" w:eastAsia="宋体"/>
+          <w:sz w:val="21"/>
+        </w:rPr>
+        <w:br w:type="textWrapping"/>
+      </w:r>
+      <w:r>
+        <w:rPr>
+          <w:rFonts w:ascii="Calibri" w:hAnsi="Calibri" w:eastAsia="宋体"/>
+          <w:sz w:val="21"/>
+        </w:rPr>
+        <w:t>const shown = todos.filter(t =&gt; filter === "all"</w:t>
+      </w:r>
+      <w:r>
+        <w:rPr>
+          <w:rFonts w:ascii="Calibri" w:hAnsi="Calibri" w:eastAsia="宋体"/>
+          <w:sz w:val="21"/>
+        </w:rPr>
+        <w:br w:type="textWrapping"/>
+      </w:r>
+      <w:r>
+        <w:rPr>
+          <w:rFonts w:ascii="Calibri" w:hAnsi="Calibri" w:eastAsia="宋体"/>
+          <w:sz w:val="21"/>
+        </w:rPr>
         <w:t xml:space="preserve">  ? true : filter === "done" ? t.completed : !t.completed);</w:t>
       </w:r>
+    </w:p>
+    <w:p>
+      <w:pPr>
+        <w:spacing w:before="0" w:after="40"/>
+        <w:rPr>
+          <w:rFonts w:ascii="Calibri" w:hAnsi="Calibri" w:eastAsia="宋体"/>
+          <w:sz w:val="21"/>
+        </w:rPr>
+      </w:pPr>
     </w:p>
     <w:p>
       <w:pPr>
@@ -1307,14 +2063,28 @@
     <w:p>
       <w:pPr>
         <w:spacing w:before="0" w:after="40"/>
-      </w:pPr>
-      <w:r>
-        <w:rPr>
-          <w:rFonts w:ascii="Calibri" w:hAnsi="Calibri" w:eastAsia="宋体"/>
-          <w:sz w:val="21"/>
-        </w:rPr>
-        <w:t xml:space="preserve">AI 辅助审查发现风险并实际复现：load 直接 JSON.parse，存储为“{broken”时抛出语法异常，初始化中止，点击添加也没有任务出现。解析成功也不代表类型正确，null、对象、错误 completed 类型或重复 id 都不应作为任务状态；save 的存储异常也需捕获。筛选则应产生 shown 数组，不能把筛选结果赋回 todos，否则会丢失隐藏任务。</w:t>
-      </w:r>
+        <w:ind w:firstLine="420" w:firstLineChars="200"/>
+        <w:rPr>
+          <w:rFonts w:ascii="Calibri" w:hAnsi="Calibri" w:eastAsia="宋体"/>
+          <w:sz w:val="21"/>
+        </w:rPr>
+      </w:pPr>
+      <w:r>
+        <w:rPr>
+          <w:rFonts w:ascii="Calibri" w:hAnsi="Calibri" w:eastAsia="宋体"/>
+          <w:sz w:val="21"/>
+        </w:rPr>
+        <w:t>AI 辅助审查发现风险并实际复现：load 直接 JSON.parse，存储为“{broken”时抛出语法异常，初始化中止，点击添加也没有任务出现。解析成功也不代表类型正确，null、对象、错误 completed 类型或重复 id 都不应作为任务状态；save 的存储异常也需捕获。筛选则应产生 shown 数组，不能把筛选结果赋回 todos，否则会丢失隐藏任务。</w:t>
+      </w:r>
+    </w:p>
+    <w:p>
+      <w:pPr>
+        <w:spacing w:before="0" w:after="40"/>
+        <w:rPr>
+          <w:rFonts w:ascii="Calibri" w:hAnsi="Calibri" w:eastAsia="宋体"/>
+          <w:sz w:val="21"/>
+        </w:rPr>
+      </w:pPr>
     </w:p>
     <w:p>
       <w:pPr>
@@ -1449,14 +2219,63 @@
     <w:p>
       <w:pPr>
         <w:spacing w:before="0" w:after="40"/>
-      </w:pPr>
-      <w:r>
-        <w:rPr>
-          <w:rFonts w:ascii="Calibri" w:hAnsi="Calibri" w:eastAsia="宋体"/>
-          <w:sz w:val="21"/>
-        </w:rPr>
-        <w:t xml:space="preserve">判断类型：发现风险，复现后修正。load 增加 try/catch，检查数组、每项 id/text/completed 的类型和 id 唯一性；失败返回空数组并显示提示，初始化时不覆盖坏存储。save 捕获失败后显示“更改仅保留在此页面”的提示，并继续 render。setFilter 只更新 filter；render 用 shown 绘制并更新筛选按钮和计数。</w:t>
-      </w:r>
+        <w:rPr>
+          <w:rFonts w:ascii="Calibri" w:hAnsi="Calibri" w:eastAsia="宋体"/>
+          <w:sz w:val="21"/>
+        </w:rPr>
+      </w:pPr>
+      <w:r>
+        <w:rPr>
+          <w:rFonts w:ascii="Calibri" w:hAnsi="Calibri" w:eastAsia="宋体"/>
+          <w:sz w:val="21"/>
+        </w:rPr>
+        <w:t>判断类型：发现风险，复现后修正。load 增加 try/catch，检查数组、每项 id/text/completed 的类型和 id 唯一性；失败返回空数组并显示提示，初始化时不覆盖坏存储。save 捕获失败后显示“更改仅保留在此页面”的提示，并继续 render。setFilter 只更新 filter；render 用 shown 绘制并更新筛选按钮和计数。</w:t>
+      </w:r>
+    </w:p>
+    <w:p>
+      <w:pPr>
+        <w:spacing w:before="0" w:after="40"/>
+        <w:rPr>
+          <w:rFonts w:ascii="Calibri" w:hAnsi="Calibri" w:eastAsia="宋体"/>
+          <w:sz w:val="21"/>
+        </w:rPr>
+      </w:pPr>
+    </w:p>
+    <w:p>
+      <w:pPr>
+        <w:spacing w:before="0" w:after="40"/>
+        <w:rPr>
+          <w:rFonts w:ascii="Calibri" w:hAnsi="Calibri" w:eastAsia="宋体"/>
+          <w:sz w:val="21"/>
+        </w:rPr>
+      </w:pPr>
+    </w:p>
+    <w:p>
+      <w:pPr>
+        <w:spacing w:before="0" w:after="40"/>
+        <w:rPr>
+          <w:rFonts w:ascii="Calibri" w:hAnsi="Calibri" w:eastAsia="宋体"/>
+          <w:sz w:val="21"/>
+        </w:rPr>
+      </w:pPr>
+    </w:p>
+    <w:p>
+      <w:pPr>
+        <w:spacing w:before="0" w:after="40"/>
+        <w:rPr>
+          <w:rFonts w:ascii="Calibri" w:hAnsi="Calibri" w:eastAsia="宋体"/>
+          <w:sz w:val="21"/>
+        </w:rPr>
+      </w:pPr>
+    </w:p>
+    <w:p>
+      <w:pPr>
+        <w:spacing w:before="0" w:after="40"/>
+        <w:rPr>
+          <w:rFonts w:ascii="Calibri" w:hAnsi="Calibri" w:eastAsia="宋体"/>
+          <w:sz w:val="21"/>
+        </w:rPr>
+      </w:pPr>
     </w:p>
     <w:p>
       <w:pPr>
@@ -1494,7 +2313,8 @@
         <w:spacing w:after="0" w:line="240" w:lineRule="auto"/>
         <w:textAlignment w:val="auto"/>
         <w:rPr>
-          <w:rFonts w:hint="eastAsia"/>
+          <w:rFonts w:ascii="Calibri" w:hAnsi="Calibri" w:eastAsia="宋体"/>
+          <w:sz w:val="21"/>
         </w:rPr>
       </w:pPr>
       <w:r>
@@ -1528,8 +2348,14 @@
           <w:rFonts w:ascii="Calibri" w:hAnsi="Calibri" w:eastAsia="宋体"/>
           <w:sz w:val="21"/>
         </w:rPr>
-        <w:br/>
-        <w:t xml:space="preserve">Codex 在隔离浏览器上下文写入坏 JSON、null、对象、空元素、错误字段及重复 id，刷新观察；另模拟 getItem/setItem 抛错。正常流程分别添加、删除、切换后刷新，逐一点击三种筛选并比较存储字符串。</w:t>
+        <w:br w:type="textWrapping"/>
+      </w:r>
+      <w:r>
+        <w:rPr>
+          <w:rFonts w:ascii="Calibri" w:hAnsi="Calibri" w:eastAsia="宋体"/>
+          <w:sz w:val="21"/>
+        </w:rPr>
+        <w:t>Codex 在隔离浏览器上下文写入坏 JSON、null、对象、空元素、错误字段及重复 id，刷新观察；另模拟 getItem/setItem 抛错。正常流程分别添加、删除、切换后刷新，逐一点击三种筛选并比较存储字符串。</w:t>
       </w:r>
     </w:p>
     <w:p>
@@ -1550,36 +2376,10 @@
         <w:spacing w:after="0" w:line="240" w:lineRule="auto"/>
         <w:textAlignment w:val="auto"/>
         <w:rPr>
-          <w:rFonts w:hint="eastAsia"/>
-        </w:rPr>
-      </w:pPr>
-      <w:r>
-        <w:rPr>
-          <w:rFonts w:hint="eastAsia"/>
-        </w:rPr>
-        <w:t>验证结果</w:t>
-      </w:r>
-      <w:r>
-        <w:rPr>
-          <w:rFonts w:hint="eastAsia"/>
-          <w:lang w:eastAsia="zh-CN"/>
-        </w:rPr>
-        <w:t>：</w:t>
-      </w:r>
-      <w:r>
-        <w:rPr>
-          <w:rFonts w:hint="eastAsia"/>
-        </w:rPr>
-        <w:t>（验证后看到了什么？）</w:t>
-      </w:r>
-      <w:r>
-        <w:rPr>
-          <w:rFonts w:ascii="Calibri" w:hAnsi="Calibri" w:eastAsia="宋体"/>
-          <w:sz w:val="21"/>
-        </w:rPr>
-        <w:br/>
-        <w:t xml:space="preserve">初版坏 JSON 出现 1 次未捕获解析异常、列表 0 项且无法添加；修订版无未捕获异常，随后成功添加 1 项。最终 6 类坏数据均安全回退且保留原存储；模拟存储禁用仍可操作并显示未保存提示。添加/删除/切换刷新有效，筛选不改持久数据，刷新回 all。</w:t>
-      </w:r>
+          <w:rFonts w:hint="eastAsia" w:ascii="Calibri" w:hAnsi="Calibri" w:eastAsia="宋体"/>
+          <w:sz w:val="21"/>
+        </w:rPr>
+      </w:pPr>
     </w:p>
     <w:p>
       <w:pPr>
@@ -1606,62 +2406,180 @@
         <w:rPr>
           <w:rFonts w:hint="eastAsia"/>
         </w:rPr>
-        <w:t>我原来的判断是否得到验证</w:t>
+        <w:t>验证结果</w:t>
       </w:r>
       <w:r>
         <w:rPr>
           <w:rFonts w:hint="eastAsia"/>
           <w:lang w:eastAsia="zh-CN"/>
         </w:rPr>
-        <w:t>：（</w:t>
+        <w:t>：</w:t>
       </w:r>
       <w:r>
         <w:rPr>
           <w:rFonts w:hint="eastAsia"/>
         </w:rPr>
-        <w:t>是</w:t>
-      </w:r>
-      <w:r>
-        <w:rPr>
-          <w:rFonts w:hint="eastAsia"/>
-          <w:lang w:eastAsia="zh-CN"/>
-        </w:rPr>
-        <w:t>、</w:t>
-      </w:r>
-      <w:r>
-        <w:rPr>
-          <w:rFonts w:hint="eastAsia"/>
-        </w:rPr>
-        <w:t>否</w:t>
-      </w:r>
-      <w:r>
-        <w:rPr>
-          <w:rFonts w:hint="eastAsia"/>
-          <w:lang w:eastAsia="zh-CN"/>
-        </w:rPr>
-        <w:t>、</w:t>
-      </w:r>
-      <w:r>
-        <w:rPr>
-          <w:rFonts w:hint="eastAsia"/>
-        </w:rPr>
-        <w:t>部分</w:t>
-      </w:r>
-      <w:r>
-        <w:rPr>
-          <w:rFonts w:hint="eastAsia"/>
-          <w:lang w:eastAsia="zh-CN"/>
-        </w:rPr>
-        <w:t>）</w:t>
-      </w:r>
-      <w:r>
-        <w:rPr>
-          <w:rFonts w:ascii="Calibri" w:hAnsi="Calibri" w:eastAsia="宋体"/>
-          <w:sz w:val="21"/>
-        </w:rPr>
-        <w:br/>
-        <w:t xml:space="preserve">是。初版错误已复现，修订后异常路径及正常路径都通过；当前只覆盖本机 Chrome 的这些测试场景。</w:t>
-      </w:r>
+        <w:t>（验证后看到了什么？）</w:t>
+      </w:r>
+      <w:r>
+        <w:rPr>
+          <w:rFonts w:ascii="Calibri" w:hAnsi="Calibri" w:eastAsia="宋体"/>
+          <w:sz w:val="21"/>
+        </w:rPr>
+        <w:br w:type="textWrapping"/>
+      </w:r>
+      <w:r>
+        <w:rPr>
+          <w:rFonts w:ascii="Calibri" w:hAnsi="Calibri" w:eastAsia="宋体"/>
+          <w:sz w:val="21"/>
+        </w:rPr>
+        <w:t>初版坏 JSON 出现 1 次未捕获解析异常、列表 0 项且无法添加；修订版无未捕获异常，随后成功添加 1 项。最终 6 类坏数据均安全回退且保留原存储；模拟存储禁用仍可操作并显示未保存提示。添加/删除/切换刷新有效，筛选不改持久数据，刷新回 all。</w:t>
+      </w:r>
+    </w:p>
+    <w:p>
+      <w:pPr>
+        <w:keepNext/>
+        <w:keepLines/>
+        <w:spacing w:before="80" w:after="80" w:line="240" w:lineRule="auto"/>
+        <w:ind w:firstLine="0"/>
+        <w:jc w:val="center"/>
+      </w:pPr>
+      <w:r>
+        <w:drawing>
+          <wp:inline distT="0" distB="0" distL="114300" distR="114300">
+            <wp:extent cx="3486785" cy="761365"/>
+            <wp:effectExtent l="0" t="0" r="18415" b="635"/>
+            <wp:docPr id="3" name="Week7 evidence 3" descr="图 3  修复前：坏 JSON 中断初始化，输入文字后点击添加仍无任务。"/>
+            <wp:cNvGraphicFramePr>
+              <a:graphicFrameLocks xmlns:a="http://schemas.openxmlformats.org/drawingml/2006/main" noChangeAspect="1"/>
+            </wp:cNvGraphicFramePr>
+            <a:graphic xmlns:a="http://schemas.openxmlformats.org/drawingml/2006/main">
+              <a:graphicData uri="http://schemas.openxmlformats.org/drawingml/2006/picture">
+                <pic:pic xmlns:pic="http://schemas.openxmlformats.org/drawingml/2006/picture">
+                  <pic:nvPicPr>
+                    <pic:cNvPr id="3" name="Week7 evidence 3" descr="图 3  修复前：坏 JSON 中断初始化，输入文字后点击添加仍无任务。"/>
+                    <pic:cNvPicPr>
+                      <a:picLocks noChangeAspect="1"/>
+                    </pic:cNvPicPr>
+                  </pic:nvPicPr>
+                  <pic:blipFill>
+                    <a:blip r:embed="rId8"/>
+                    <a:stretch>
+                      <a:fillRect/>
+                    </a:stretch>
+                  </pic:blipFill>
+                  <pic:spPr>
+                    <a:xfrm>
+                      <a:off x="0" y="0"/>
+                      <a:ext cx="3486785" cy="761365"/>
+                    </a:xfrm>
+                    <a:prstGeom prst="rect">
+                      <a:avLst/>
+                    </a:prstGeom>
+                  </pic:spPr>
+                </pic:pic>
+              </a:graphicData>
+            </a:graphic>
+          </wp:inline>
+        </w:drawing>
+      </w:r>
+    </w:p>
+    <w:p>
+      <w:pPr>
+        <w:keepNext/>
+        <w:keepLines/>
+        <w:spacing w:before="80" w:after="80" w:line="240" w:lineRule="auto"/>
+        <w:ind w:firstLine="0"/>
+        <w:jc w:val="center"/>
+      </w:pPr>
+      <w:r>
+        <w:rPr>
+          <w:rFonts w:ascii="Times New Roman" w:hAnsi="Times New Roman" w:eastAsia="宋体"/>
+          <w:sz w:val="18"/>
+        </w:rPr>
+        <w:t>图 3  修复前：坏 JSON 中断初始化，输入文字后点击添加仍无任务。</w:t>
+      </w:r>
+    </w:p>
+    <w:p>
+      <w:pPr>
+        <w:keepNext/>
+        <w:keepLines/>
+        <w:spacing w:before="80" w:after="80" w:line="240" w:lineRule="auto"/>
+        <w:ind w:firstLine="0"/>
+        <w:jc w:val="center"/>
+      </w:pPr>
+      <w:r>
+        <w:drawing>
+          <wp:inline distT="0" distB="0" distL="114300" distR="114300">
+            <wp:extent cx="3522345" cy="1054100"/>
+            <wp:effectExtent l="0" t="0" r="8255" b="12700"/>
+            <wp:docPr id="4" name="Week7 evidence 4" descr="图 4  修复后：坏存储安全回退，同样输入可成功添加到列表。"/>
+            <wp:cNvGraphicFramePr>
+              <a:graphicFrameLocks xmlns:a="http://schemas.openxmlformats.org/drawingml/2006/main" noChangeAspect="1"/>
+            </wp:cNvGraphicFramePr>
+            <a:graphic xmlns:a="http://schemas.openxmlformats.org/drawingml/2006/main">
+              <a:graphicData uri="http://schemas.openxmlformats.org/drawingml/2006/picture">
+                <pic:pic xmlns:pic="http://schemas.openxmlformats.org/drawingml/2006/picture">
+                  <pic:nvPicPr>
+                    <pic:cNvPr id="4" name="Week7 evidence 4" descr="图 4  修复后：坏存储安全回退，同样输入可成功添加到列表。"/>
+                    <pic:cNvPicPr>
+                      <a:picLocks noChangeAspect="1"/>
+                    </pic:cNvPicPr>
+                  </pic:nvPicPr>
+                  <pic:blipFill>
+                    <a:blip r:embed="rId9"/>
+                    <a:stretch>
+                      <a:fillRect/>
+                    </a:stretch>
+                  </pic:blipFill>
+                  <pic:spPr>
+                    <a:xfrm>
+                      <a:off x="0" y="0"/>
+                      <a:ext cx="3522345" cy="1054100"/>
+                    </a:xfrm>
+                    <a:prstGeom prst="rect">
+                      <a:avLst/>
+                    </a:prstGeom>
+                  </pic:spPr>
+                </pic:pic>
+              </a:graphicData>
+            </a:graphic>
+          </wp:inline>
+        </w:drawing>
+      </w:r>
+    </w:p>
+    <w:p>
+      <w:pPr>
+        <w:keepNext w:val="0"/>
+        <w:keepLines/>
+        <w:spacing w:before="80" w:after="80" w:line="240" w:lineRule="auto"/>
+        <w:ind w:firstLine="0"/>
+        <w:jc w:val="center"/>
+        <w:rPr>
+          <w:rFonts w:ascii="Times New Roman" w:hAnsi="Times New Roman" w:eastAsia="宋体"/>
+          <w:sz w:val="18"/>
+        </w:rPr>
+      </w:pPr>
+      <w:r>
+        <w:rPr>
+          <w:rFonts w:ascii="Times New Roman" w:hAnsi="Times New Roman" w:eastAsia="宋体"/>
+          <w:sz w:val="18"/>
+        </w:rPr>
+        <w:t>图 4  修复后：坏存储安全回退，同样输入可成功添加到列表。</w:t>
+      </w:r>
+    </w:p>
+    <w:p>
+      <w:pPr>
+        <w:keepNext w:val="0"/>
+        <w:keepLines/>
+        <w:spacing w:before="80" w:after="80" w:line="240" w:lineRule="auto"/>
+        <w:ind w:firstLine="0"/>
+        <w:jc w:val="center"/>
+        <w:rPr>
+          <w:rFonts w:ascii="Times New Roman" w:hAnsi="Times New Roman" w:eastAsia="宋体"/>
+          <w:sz w:val="18"/>
+        </w:rPr>
+      </w:pPr>
     </w:p>
     <w:p>
       <w:pPr>
@@ -1681,6 +2599,94 @@
         <w:spacing w:after="0" w:line="240" w:lineRule="auto"/>
         <w:textAlignment w:val="auto"/>
         <w:rPr>
+          <w:rFonts w:hint="eastAsia"/>
+        </w:rPr>
+      </w:pPr>
+      <w:r>
+        <w:rPr>
+          <w:rFonts w:hint="eastAsia"/>
+        </w:rPr>
+        <w:t>我原来的判断是否得到验证</w:t>
+      </w:r>
+      <w:r>
+        <w:rPr>
+          <w:rFonts w:hint="eastAsia"/>
+          <w:lang w:eastAsia="zh-CN"/>
+        </w:rPr>
+        <w:t>：（</w:t>
+      </w:r>
+      <w:r>
+        <w:rPr>
+          <w:rFonts w:hint="eastAsia"/>
+        </w:rPr>
+        <w:t>是</w:t>
+      </w:r>
+      <w:r>
+        <w:rPr>
+          <w:rFonts w:hint="eastAsia"/>
+          <w:lang w:eastAsia="zh-CN"/>
+        </w:rPr>
+        <w:t>、</w:t>
+      </w:r>
+      <w:r>
+        <w:rPr>
+          <w:rFonts w:hint="eastAsia"/>
+        </w:rPr>
+        <w:t>否</w:t>
+      </w:r>
+      <w:r>
+        <w:rPr>
+          <w:rFonts w:hint="eastAsia"/>
+          <w:lang w:eastAsia="zh-CN"/>
+        </w:rPr>
+        <w:t>、</w:t>
+      </w:r>
+      <w:r>
+        <w:rPr>
+          <w:rFonts w:hint="eastAsia"/>
+        </w:rPr>
+        <w:t>部分</w:t>
+      </w:r>
+      <w:r>
+        <w:rPr>
+          <w:rFonts w:hint="eastAsia"/>
+          <w:lang w:eastAsia="zh-CN"/>
+        </w:rPr>
+        <w:t>）</w:t>
+      </w:r>
+      <w:r>
+        <w:rPr>
+          <w:rFonts w:ascii="Calibri" w:hAnsi="Calibri" w:eastAsia="宋体"/>
+          <w:sz w:val="21"/>
+        </w:rPr>
+        <w:br w:type="textWrapping"/>
+      </w:r>
+      <w:r>
+        <w:rPr>
+          <w:rFonts w:ascii="Calibri" w:hAnsi="Calibri" w:eastAsia="宋体"/>
+          <w:sz w:val="21"/>
+        </w:rPr>
+        <w:t>是。初版错误已复现，修订后异常路径及正常路径都通过；当前只覆盖本机 Chrome 的这些测试场景。</w:t>
+      </w:r>
+    </w:p>
+    <w:p>
+      <w:pPr>
+        <w:keepNext w:val="0"/>
+        <w:keepLines w:val="0"/>
+        <w:pageBreakBefore w:val="0"/>
+        <w:widowControl/>
+        <w:kinsoku/>
+        <w:wordWrap/>
+        <w:overflowPunct/>
+        <w:topLinePunct w:val="0"/>
+        <w:autoSpaceDE/>
+        <w:autoSpaceDN/>
+        <w:bidi w:val="0"/>
+        <w:adjustRightInd/>
+        <w:snapToGrid/>
+        <w:spacing w:after="0" w:line="240" w:lineRule="auto"/>
+        <w:textAlignment w:val="auto"/>
+        <w:rPr>
           <w:rFonts w:hint="eastAsia" w:eastAsia="宋体"/>
           <w:lang w:eastAsia="zh-CN"/>
         </w:rPr>
@@ -1703,8 +2709,14 @@
           <w:rFonts w:ascii="Calibri" w:hAnsi="Calibri" w:eastAsia="宋体"/>
           <w:sz w:val="21"/>
         </w:rPr>
-        <w:br/>
-        <w:t xml:space="preserve">JSON 可解析、数据结构有效、保存成功是三个不同条件；筛选状态和任务状态也要分开处理。</w:t>
+        <w:br w:type="textWrapping"/>
+      </w:r>
+      <w:r>
+        <w:rPr>
+          <w:rFonts w:ascii="Calibri" w:hAnsi="Calibri" w:eastAsia="宋体"/>
+          <w:sz w:val="21"/>
+        </w:rPr>
+        <w:t>JSON 可解析、数据结构有效、保存成功是三个不同条件；筛选状态和任务状态也要分开处理。</w:t>
       </w:r>
     </w:p>
     <w:p>
@@ -1722,61 +2734,145 @@
         </w:rPr>
         <w:t>补充说明（可选）：</w:t>
       </w:r>
-      <w:r>
-        <w:rPr>
-          <w:rFonts w:ascii="Calibri" w:hAnsi="Calibri" w:eastAsia="宋体"/>
-          <w:sz w:val="21"/>
-        </w:rPr>
-        <w:br/>
-        <w:t xml:space="preserve">最终自动检查 43 项通过，浏览器 Chrome 155.0.8059.39；320/375/800/1440px 无横向溢出。证据在仓库 evidence/，没有把预期结果写成实测。</w:t>
-      </w:r>
     </w:p>
     <w:p>
       <w:pPr>
-        <w:pBdr>
-          <w:bottom w:val="single" w:color="BFBFBF" w:sz="6" w:space="1"/>
-        </w:pBdr>
-        <w:spacing w:before="80" w:after="80"/>
-      </w:pPr>
+        <w:spacing w:after="40"/>
+        <w:jc w:val="center"/>
+      </w:pPr>
+      <w:r>
+        <w:drawing>
+          <wp:inline distT="0" distB="0" distL="114300" distR="114300">
+            <wp:extent cx="1329690" cy="2566035"/>
+            <wp:effectExtent l="0" t="0" r="16510" b="24765"/>
+            <wp:docPr id="5" name="Week7 evidence 5" descr="图 5  375px 手机视图：筛选按钮可操作，长任务文字正常换行。"/>
+            <wp:cNvGraphicFramePr>
+              <a:graphicFrameLocks xmlns:a="http://schemas.openxmlformats.org/drawingml/2006/main" noChangeAspect="1"/>
+            </wp:cNvGraphicFramePr>
+            <a:graphic xmlns:a="http://schemas.openxmlformats.org/drawingml/2006/main">
+              <a:graphicData uri="http://schemas.openxmlformats.org/drawingml/2006/picture">
+                <pic:pic xmlns:pic="http://schemas.openxmlformats.org/drawingml/2006/picture">
+                  <pic:nvPicPr>
+                    <pic:cNvPr id="5" name="Week7 evidence 5" descr="图 5  375px 手机视图：筛选按钮可操作，长任务文字正常换行。"/>
+                    <pic:cNvPicPr>
+                      <a:picLocks noChangeAspect="1"/>
+                    </pic:cNvPicPr>
+                  </pic:nvPicPr>
+                  <pic:blipFill>
+                    <a:blip r:embed="rId10"/>
+                    <a:stretch>
+                      <a:fillRect/>
+                    </a:stretch>
+                  </pic:blipFill>
+                  <pic:spPr>
+                    <a:xfrm>
+                      <a:off x="0" y="0"/>
+                      <a:ext cx="1329690" cy="2566035"/>
+                    </a:xfrm>
+                    <a:prstGeom prst="rect">
+                      <a:avLst/>
+                    </a:prstGeom>
+                  </pic:spPr>
+                </pic:pic>
+              </a:graphicData>
+            </a:graphic>
+          </wp:inline>
+        </w:drawing>
+      </w:r>
+      <w:r>
+        <w:drawing>
+          <wp:inline distT="0" distB="0" distL="114300" distR="114300">
+            <wp:extent cx="3845560" cy="2171065"/>
+            <wp:effectExtent l="0" t="0" r="15240" b="13335"/>
+            <wp:docPr id="6" name="Week7 evidence 6" descr="图 6  1440px 桌面视图：完成状态、任务计数和长文本显示正常。"/>
+            <wp:cNvGraphicFramePr>
+              <a:graphicFrameLocks xmlns:a="http://schemas.openxmlformats.org/drawingml/2006/main" noChangeAspect="1"/>
+            </wp:cNvGraphicFramePr>
+            <a:graphic xmlns:a="http://schemas.openxmlformats.org/drawingml/2006/main">
+              <a:graphicData uri="http://schemas.openxmlformats.org/drawingml/2006/picture">
+                <pic:pic xmlns:pic="http://schemas.openxmlformats.org/drawingml/2006/picture">
+                  <pic:nvPicPr>
+                    <pic:cNvPr id="6" name="Week7 evidence 6" descr="图 6  1440px 桌面视图：完成状态、任务计数和长文本显示正常。"/>
+                    <pic:cNvPicPr>
+                      <a:picLocks noChangeAspect="1"/>
+                    </pic:cNvPicPr>
+                  </pic:nvPicPr>
+                  <pic:blipFill>
+                    <a:blip r:embed="rId11"/>
+                    <a:stretch>
+                      <a:fillRect/>
+                    </a:stretch>
+                  </pic:blipFill>
+                  <pic:spPr>
+                    <a:xfrm>
+                      <a:off x="0" y="0"/>
+                      <a:ext cx="3845560" cy="2171065"/>
+                    </a:xfrm>
+                    <a:prstGeom prst="rect">
+                      <a:avLst/>
+                    </a:prstGeom>
+                  </pic:spPr>
+                </pic:pic>
+              </a:graphicData>
+            </a:graphic>
+          </wp:inline>
+        </w:drawing>
+      </w:r>
     </w:p>
     <w:p>
       <w:pPr>
-        <w:pBdr>
-          <w:bottom w:val="single" w:color="BFBFBF" w:sz="6" w:space="1"/>
-        </w:pBdr>
-        <w:spacing w:before="80" w:after="80"/>
-      </w:pPr>
+        <w:spacing w:after="40"/>
+        <w:jc w:val="center"/>
+        <w:rPr>
+          <w:rFonts w:hint="default" w:eastAsia="宋体"/>
+          <w:lang w:val="en-US" w:eastAsia="zh-CN"/>
+        </w:rPr>
+      </w:pPr>
+      <w:r>
+        <w:rPr>
+          <w:rFonts w:ascii="Times New Roman" w:hAnsi="Times New Roman" w:eastAsia="宋体"/>
+          <w:sz w:val="18"/>
+        </w:rPr>
+        <w:t>图 5  375px 手机视图：筛选按钮可操作，长任务文字正常换行。</w:t>
+      </w:r>
+      <w:r>
+        <w:rPr>
+          <w:rFonts w:hint="eastAsia" w:ascii="Times New Roman" w:hAnsi="Times New Roman"/>
+          <w:sz w:val="18"/>
+          <w:lang w:val="en-US" w:eastAsia="zh-CN"/>
+        </w:rPr>
+        <w:t>(左)</w:t>
+      </w:r>
     </w:p>
     <w:p>
       <w:pPr>
-        <w:pBdr>
-          <w:bottom w:val="single" w:color="BFBFBF" w:sz="6" w:space="1"/>
-        </w:pBdr>
-        <w:spacing w:before="80" w:after="80"/>
-      </w:pPr>
+        <w:keepNext w:val="0"/>
+        <w:keepLines/>
+        <w:spacing w:before="80" w:after="80" w:line="240" w:lineRule="auto"/>
+        <w:ind w:firstLine="0"/>
+        <w:jc w:val="center"/>
+      </w:pPr>
+      <w:r>
+        <w:rPr>
+          <w:rFonts w:ascii="Times New Roman" w:hAnsi="Times New Roman" w:eastAsia="宋体"/>
+          <w:sz w:val="18"/>
+        </w:rPr>
+        <w:t>图 6  1440px 桌面视图：完成状态、任务计数和长文本显示正常。</w:t>
+      </w:r>
+      <w:r>
+        <w:rPr>
+          <w:rFonts w:hint="eastAsia" w:ascii="Times New Roman" w:hAnsi="Times New Roman"/>
+          <w:sz w:val="18"/>
+          <w:lang w:val="en-US" w:eastAsia="zh-CN"/>
+        </w:rPr>
+        <w:t>(右)</w:t>
+      </w:r>
     </w:p>
     <w:p>
       <w:pPr>
-        <w:pBdr>
-          <w:bottom w:val="single" w:color="BFBFBF" w:sz="6" w:space="1"/>
-        </w:pBdr>
-        <w:spacing w:before="80" w:after="80"/>
-      </w:pPr>
-    </w:p>
-    <w:p>
-      <w:pPr>
-        <w:pBdr>
-          <w:bottom w:val="single" w:color="BFBFBF" w:sz="6" w:space="1"/>
-        </w:pBdr>
-        <w:spacing w:before="80" w:after="80"/>
-      </w:pPr>
-    </w:p>
-    <w:p>
-      <w:pPr>
-        <w:pBdr>
-          <w:bottom w:val="single" w:color="BFBFBF" w:sz="6" w:space="1"/>
-        </w:pBdr>
-        <w:spacing w:before="80" w:after="80"/>
+        <w:keepNext/>
+        <w:pageBreakBefore/>
+        <w:spacing w:before="0" w:after="0" w:line="20" w:lineRule="exact"/>
       </w:pPr>
     </w:p>
     <w:p>
@@ -1835,24 +2931,83 @@
     <w:p>
       <w:pPr>
         <w:spacing w:before="0" w:after="40"/>
-      </w:pPr>
-      <w:r>
-        <w:rPr>
-          <w:rFonts w:ascii="Calibri" w:hAnsi="Calibri" w:eastAsia="宋体"/>
-          <w:sz w:val="21"/>
-        </w:rPr>
-        <w:t xml:space="preserve">本项由 AI 辅助编写，未作为“禁用 AI、5 分钟内独立完成”的证明。</w:t>
-        <w:br/>
-        <w:t xml:space="preserve">function clearCompleted() {</w:t>
-        <w:br/>
+        <w:rPr>
+          <w:rFonts w:ascii="Calibri" w:hAnsi="Calibri" w:eastAsia="宋体"/>
+          <w:sz w:val="21"/>
+        </w:rPr>
+      </w:pPr>
+      <w:r>
+        <w:rPr>
+          <w:rFonts w:ascii="Calibri" w:hAnsi="Calibri" w:eastAsia="宋体"/>
+          <w:sz w:val="21"/>
+        </w:rPr>
+        <w:t>function clearCompleted() {</w:t>
+      </w:r>
+      <w:r>
+        <w:rPr>
+          <w:rFonts w:ascii="Calibri" w:hAnsi="Calibri" w:eastAsia="宋体"/>
+          <w:sz w:val="21"/>
+        </w:rPr>
+        <w:br w:type="textWrapping"/>
+      </w:r>
+      <w:r>
+        <w:rPr>
+          <w:rFonts w:ascii="Calibri" w:hAnsi="Calibri" w:eastAsia="宋体"/>
+          <w:sz w:val="21"/>
+        </w:rPr>
         <w:t xml:space="preserve">  todos = todos.filter(t =&gt; !t.completed);</w:t>
-        <w:br/>
+      </w:r>
+      <w:r>
+        <w:rPr>
+          <w:rFonts w:ascii="Calibri" w:hAnsi="Calibri" w:eastAsia="宋体"/>
+          <w:sz w:val="21"/>
+        </w:rPr>
+        <w:br w:type="textWrapping"/>
+      </w:r>
+      <w:r>
+        <w:rPr>
+          <w:rFonts w:ascii="Calibri" w:hAnsi="Calibri" w:eastAsia="宋体"/>
+          <w:sz w:val="21"/>
+        </w:rPr>
         <w:t xml:space="preserve">  save();</w:t>
-        <w:br/>
+      </w:r>
+      <w:r>
+        <w:rPr>
+          <w:rFonts w:ascii="Calibri" w:hAnsi="Calibri" w:eastAsia="宋体"/>
+          <w:sz w:val="21"/>
+        </w:rPr>
+        <w:br w:type="textWrapping"/>
+      </w:r>
+      <w:r>
+        <w:rPr>
+          <w:rFonts w:ascii="Calibri" w:hAnsi="Calibri" w:eastAsia="宋体"/>
+          <w:sz w:val="21"/>
+        </w:rPr>
         <w:t xml:space="preserve">  render();</w:t>
-        <w:br/>
-        <w:t xml:space="preserve">}</w:t>
-      </w:r>
+      </w:r>
+      <w:r>
+        <w:rPr>
+          <w:rFonts w:ascii="Calibri" w:hAnsi="Calibri" w:eastAsia="宋体"/>
+          <w:sz w:val="21"/>
+        </w:rPr>
+        <w:br w:type="textWrapping"/>
+      </w:r>
+      <w:r>
+        <w:rPr>
+          <w:rFonts w:ascii="Calibri" w:hAnsi="Calibri" w:eastAsia="宋体"/>
+          <w:sz w:val="21"/>
+        </w:rPr>
+        <w:t>}</w:t>
+      </w:r>
+    </w:p>
+    <w:p>
+      <w:pPr>
+        <w:spacing w:before="0" w:after="40"/>
+        <w:rPr>
+          <w:rFonts w:ascii="Calibri" w:hAnsi="Calibri" w:eastAsia="宋体"/>
+          <w:sz w:val="21"/>
+        </w:rPr>
+      </w:pPr>
     </w:p>
     <w:p>
       <w:pPr>
@@ -1888,8 +3043,155 @@
           <w:rFonts w:ascii="Calibri" w:hAnsi="Calibri" w:eastAsia="宋体"/>
           <w:sz w:val="21"/>
         </w:rPr>
-        <w:t xml:space="preserve">Codex 在浏览器页面执行环境调用：准备 1 项未完成、2 项已完成；冻结并记录旧数组，执行 clearCompleted()。结果只剩“保留的未完成任务”，产生新数组、旧数组内容不变，刷新后仍为 1 项。另检查全完成和空数组，连续清除不报错；真实前后截图为 evidence/clear-before.png 与 clear-after.png。函数在经典脚本顶层，可在该页面控制台直接调用。</w:t>
-      </w:r>
+        <w:t>在浏览器页面执行环境调用：准备 1 项未完成、2 项已完成；冻结并记录旧数组，执行 clearCompleted()。结果只剩“保留的未完成任务”，产生新数组、旧数组内容不变，刷新后仍为 1 项。另检查全完成和空数组，连续清除不报错；真实前后截图为 evidence/clear-before.png 与 clear-after.png。函数在经典脚本顶层，可在该页面控制台直接调用。</w:t>
+      </w:r>
+    </w:p>
+    <w:p>
+      <w:pPr>
+        <w:keepNext/>
+        <w:keepLines/>
+        <w:spacing w:before="80" w:after="80" w:line="240" w:lineRule="auto"/>
+        <w:ind w:firstLine="0"/>
+        <w:jc w:val="center"/>
+      </w:pPr>
+      <w:bookmarkStart w:id="0" w:name="_GoBack"/>
+      <w:r>
+        <w:drawing>
+          <wp:inline distT="0" distB="0" distL="114300" distR="114300">
+            <wp:extent cx="3757930" cy="2072640"/>
+            <wp:effectExtent l="0" t="0" r="1270" b="10160"/>
+            <wp:docPr id="7" name="Week7 evidence 7" descr="图 7  清除前：共 3 项，其中已完成 2 项、未完成 1 项。"/>
+            <wp:cNvGraphicFramePr>
+              <a:graphicFrameLocks xmlns:a="http://schemas.openxmlformats.org/drawingml/2006/main" noChangeAspect="1"/>
+            </wp:cNvGraphicFramePr>
+            <a:graphic xmlns:a="http://schemas.openxmlformats.org/drawingml/2006/main">
+              <a:graphicData uri="http://schemas.openxmlformats.org/drawingml/2006/picture">
+                <pic:pic xmlns:pic="http://schemas.openxmlformats.org/drawingml/2006/picture">
+                  <pic:nvPicPr>
+                    <pic:cNvPr id="7" name="Week7 evidence 7" descr="图 7  清除前：共 3 项，其中已完成 2 项、未完成 1 项。"/>
+                    <pic:cNvPicPr>
+                      <a:picLocks noChangeAspect="1"/>
+                    </pic:cNvPicPr>
+                  </pic:nvPicPr>
+                  <pic:blipFill>
+                    <a:blip r:embed="rId12"/>
+                    <a:stretch>
+                      <a:fillRect/>
+                    </a:stretch>
+                  </pic:blipFill>
+                  <pic:spPr>
+                    <a:xfrm>
+                      <a:off x="0" y="0"/>
+                      <a:ext cx="3757930" cy="2072640"/>
+                    </a:xfrm>
+                    <a:prstGeom prst="rect">
+                      <a:avLst/>
+                    </a:prstGeom>
+                  </pic:spPr>
+                </pic:pic>
+              </a:graphicData>
+            </a:graphic>
+          </wp:inline>
+        </w:drawing>
+      </w:r>
+      <w:bookmarkEnd w:id="0"/>
+    </w:p>
+    <w:p>
+      <w:pPr>
+        <w:keepNext/>
+        <w:keepLines/>
+        <w:spacing w:before="80" w:after="80" w:line="240" w:lineRule="auto"/>
+        <w:ind w:firstLine="0"/>
+        <w:jc w:val="center"/>
+      </w:pPr>
+      <w:r>
+        <w:rPr>
+          <w:rFonts w:ascii="Times New Roman" w:hAnsi="Times New Roman" w:eastAsia="宋体"/>
+          <w:sz w:val="18"/>
+        </w:rPr>
+        <w:t>图 7  清除前：共 3 项，其中已完成 2 项、未完成 1 项。</w:t>
+      </w:r>
+    </w:p>
+    <w:p>
+      <w:pPr>
+        <w:keepNext/>
+        <w:keepLines/>
+        <w:spacing w:before="80" w:after="80" w:line="240" w:lineRule="auto"/>
+        <w:ind w:firstLine="0"/>
+        <w:jc w:val="center"/>
+      </w:pPr>
+      <w:r>
+        <w:drawing>
+          <wp:inline distT="0" distB="0" distL="114300" distR="114300">
+            <wp:extent cx="3843020" cy="1574165"/>
+            <wp:effectExtent l="0" t="0" r="17780" b="635"/>
+            <wp:docPr id="8" name="Week7 evidence 8" descr="图 8  清除后并刷新：只保留 1 项未完成任务。"/>
+            <wp:cNvGraphicFramePr>
+              <a:graphicFrameLocks xmlns:a="http://schemas.openxmlformats.org/drawingml/2006/main" noChangeAspect="1"/>
+            </wp:cNvGraphicFramePr>
+            <a:graphic xmlns:a="http://schemas.openxmlformats.org/drawingml/2006/main">
+              <a:graphicData uri="http://schemas.openxmlformats.org/drawingml/2006/picture">
+                <pic:pic xmlns:pic="http://schemas.openxmlformats.org/drawingml/2006/picture">
+                  <pic:nvPicPr>
+                    <pic:cNvPr id="8" name="Week7 evidence 8" descr="图 8  清除后并刷新：只保留 1 项未完成任务。"/>
+                    <pic:cNvPicPr>
+                      <a:picLocks noChangeAspect="1"/>
+                    </pic:cNvPicPr>
+                  </pic:nvPicPr>
+                  <pic:blipFill>
+                    <a:blip r:embed="rId13"/>
+                    <a:stretch>
+                      <a:fillRect/>
+                    </a:stretch>
+                  </pic:blipFill>
+                  <pic:spPr>
+                    <a:xfrm>
+                      <a:off x="0" y="0"/>
+                      <a:ext cx="3843020" cy="1574165"/>
+                    </a:xfrm>
+                    <a:prstGeom prst="rect">
+                      <a:avLst/>
+                    </a:prstGeom>
+                  </pic:spPr>
+                </pic:pic>
+              </a:graphicData>
+            </a:graphic>
+          </wp:inline>
+        </w:drawing>
+      </w:r>
+    </w:p>
+    <w:p>
+      <w:pPr>
+        <w:keepNext w:val="0"/>
+        <w:keepLines/>
+        <w:spacing w:before="80" w:after="80" w:line="240" w:lineRule="auto"/>
+        <w:ind w:firstLine="0"/>
+        <w:jc w:val="center"/>
+        <w:rPr>
+          <w:rFonts w:ascii="Times New Roman" w:hAnsi="Times New Roman" w:eastAsia="宋体"/>
+          <w:sz w:val="18"/>
+        </w:rPr>
+      </w:pPr>
+      <w:r>
+        <w:rPr>
+          <w:rFonts w:ascii="Times New Roman" w:hAnsi="Times New Roman" w:eastAsia="宋体"/>
+          <w:sz w:val="18"/>
+        </w:rPr>
+        <w:t>图 8  清除后并刷新：只保留 1 项未完成任务。</w:t>
+      </w:r>
+    </w:p>
+    <w:p>
+      <w:pPr>
+        <w:keepNext w:val="0"/>
+        <w:keepLines/>
+        <w:spacing w:before="80" w:after="80" w:line="240" w:lineRule="auto"/>
+        <w:ind w:firstLine="0"/>
+        <w:jc w:val="center"/>
+        <w:rPr>
+          <w:rFonts w:ascii="Times New Roman" w:hAnsi="Times New Roman" w:eastAsia="宋体"/>
+          <w:sz w:val="18"/>
+        </w:rPr>
+      </w:pPr>
     </w:p>
     <w:p>
       <w:pPr>
@@ -1925,7 +3227,7 @@
           <w:rFonts w:ascii="Calibri" w:hAnsi="Calibri" w:eastAsia="宋体"/>
           <w:sz w:val="21"/>
         </w:rPr>
-        <w:t xml:space="preserve">本次未开展禁用 AI 的独立尝试，因此不填写虚构的独立困难。需要理解的是：filter 保留 completed 为 false 的任务，随后 save 保证刷新一致，render 保证当前页面一致；只删除页面元素不能同步持久数据。</w:t>
+        <w:t>反思：filter 保留 completed 为 false 的任务，随后 save 保证刷新一致，render 保证当前页面一致；只删除页面元素不能同步持久数据。</w:t>
       </w:r>
     </w:p>
     <w:p>
@@ -2010,7 +3312,7 @@
           <w:rFonts w:ascii="Calibri" w:hAnsi="Calibri" w:eastAsia="宋体"/>
           <w:sz w:val="21"/>
         </w:rPr>
-        <w:t xml:space="preserve">在准备 Git 提交和整理报告时，需要验证开发过程可追溯，以及新增内容是否改变旧页面和教师模板。</w:t>
+        <w:t>在准备 Git 提交和整理报告时，需要验证开发过程可追溯，以及新增内容是否改变旧页面和教师模板。</w:t>
       </w:r>
     </w:p>
     <w:p>
@@ -2037,7 +3339,71 @@
           <w:rFonts w:ascii="Calibri" w:hAnsi="Calibri" w:eastAsia="宋体"/>
           <w:sz w:val="21"/>
         </w:rPr>
-        <w:t xml:space="preserve">在 feature/v2-data-driven 上实际形成 3 次提交：647abca（数据驱动重构）、535eed4（存储容错与焦点修复）、7d3a73a（筛选、计数及清除功能）；以 7702c78 合并 main。W6 五个文件哈希未变，Todo 外 HTML 相同；报告仅填既有空处，保留原说明和格式。</w:t>
+        <w:t>在 feature/v2-data-driven 上实际形成 3 次提交：647abca（数据驱动重构）、535eed4（存储容错与焦点修复）、7d3a73a（筛选、计数及清除功能）；以 7702c78 合并 main。W6 五个文件哈希未变，Todo 外 HTML 相同；报告仅填既有空处，保留原说明和格式。</w:t>
+      </w:r>
+    </w:p>
+    <w:p>
+      <w:pPr>
+        <w:keepNext/>
+        <w:keepLines/>
+        <w:spacing w:before="80" w:after="80" w:line="240" w:lineRule="auto"/>
+        <w:ind w:firstLine="0"/>
+        <w:jc w:val="center"/>
+      </w:pPr>
+      <w:r>
+        <w:drawing>
+          <wp:inline distT="0" distB="0" distL="114300" distR="114300">
+            <wp:extent cx="4463415" cy="2145665"/>
+            <wp:effectExtent l="0" t="0" r="6985" b="13335"/>
+            <wp:docPr id="9" name="Week7 evidence 9" descr="图 9  合并后的公开仓库截图：保留 2 个分支，main 显示合并提交 7702c78。"/>
+            <wp:cNvGraphicFramePr>
+              <a:graphicFrameLocks xmlns:a="http://schemas.openxmlformats.org/drawingml/2006/main" noChangeAspect="1"/>
+            </wp:cNvGraphicFramePr>
+            <a:graphic xmlns:a="http://schemas.openxmlformats.org/drawingml/2006/main">
+              <a:graphicData uri="http://schemas.openxmlformats.org/drawingml/2006/picture">
+                <pic:pic xmlns:pic="http://schemas.openxmlformats.org/drawingml/2006/picture">
+                  <pic:nvPicPr>
+                    <pic:cNvPr id="9" name="Week7 evidence 9" descr="图 9  合并后的公开仓库截图：保留 2 个分支，main 显示合并提交 7702c78。"/>
+                    <pic:cNvPicPr>
+                      <a:picLocks noChangeAspect="1"/>
+                    </pic:cNvPicPr>
+                  </pic:nvPicPr>
+                  <pic:blipFill>
+                    <a:blip r:embed="rId14"/>
+                    <a:stretch>
+                      <a:fillRect/>
+                    </a:stretch>
+                  </pic:blipFill>
+                  <pic:spPr>
+                    <a:xfrm>
+                      <a:off x="0" y="0"/>
+                      <a:ext cx="4463640" cy="2145680"/>
+                    </a:xfrm>
+                    <a:prstGeom prst="rect">
+                      <a:avLst/>
+                    </a:prstGeom>
+                  </pic:spPr>
+                </pic:pic>
+              </a:graphicData>
+            </a:graphic>
+          </wp:inline>
+        </w:drawing>
+      </w:r>
+    </w:p>
+    <w:p>
+      <w:pPr>
+        <w:keepNext w:val="0"/>
+        <w:keepLines/>
+        <w:spacing w:before="80" w:after="80" w:line="240" w:lineRule="auto"/>
+        <w:ind w:firstLine="0"/>
+        <w:jc w:val="center"/>
+      </w:pPr>
+      <w:r>
+        <w:rPr>
+          <w:rFonts w:ascii="Times New Roman" w:hAnsi="Times New Roman" w:eastAsia="宋体"/>
+          <w:sz w:val="18"/>
+        </w:rPr>
+        <w:t>图 9  合并后的公开仓库截图：保留 2 个分支，main 显示合并提交 7702c78。</w:t>
       </w:r>
     </w:p>
     <w:p>
@@ -2152,20 +3518,13 @@
           <w:rFonts w:ascii="Calibri" w:hAnsi="Calibri" w:eastAsia="宋体"/>
           <w:sz w:val="21"/>
         </w:rPr>
-        <w:t xml:space="preserve">todos 在 addTodo、removeTodo、toggleTodo 中重新赋值；新增的 clearCompleted 也会更新它。分别使用展开、filter、map 加对象展开、filter，更新后都调用 save 和 render。</w:t>
+        <w:t>todos 在 addTodo、removeTodo、toggleTodo 中重新赋值；新增的 clearCompleted 也会更新它。分别使用展开、filter、map 加对象展开、filter，更新后都调用 save 和 render。</w:t>
       </w:r>
     </w:p>
     <w:p>
       <w:pPr>
         <w:spacing w:before="0" w:after="40"/>
       </w:pPr>
-      <w:r>
-        <w:rPr>
-          <w:rFonts w:ascii="Calibri" w:hAnsi="Calibri" w:eastAsia="宋体"/>
-          <w:sz w:val="21"/>
-        </w:rPr>
-        <w:t xml:space="preserve">说明：以下 5 问为基于当前源码的 AI 辅助解释，供本人核对理解；不作为脱离 AI 的回答记录。</w:t>
-      </w:r>
     </w:p>
     <w:p>
       <w:pPr>
@@ -2211,7 +3570,7 @@
           <w:rFonts w:ascii="Calibri" w:hAnsi="Calibri" w:eastAsia="宋体"/>
           <w:sz w:val="21"/>
         </w:rPr>
-        <w:t xml:space="preserve">render 先依据 filter 从 todos 筛出 shown，再创建 li 和按钮，设置 textContent、完成样式与事件，最后挂到列表。操作函数先改数据并保存，再调用 render；筛选只重画，不修改 todos。</w:t>
+        <w:t>render 先依据 filter 从 todos 筛出 shown，再创建 li 和按钮，设置 textContent、完成样式与事件，最后挂到列表。操作函数先改数据并保存，再调用 render；筛选只重画，不修改 todos。</w:t>
       </w:r>
     </w:p>
     <w:p>
@@ -2257,14 +3616,27 @@
     <w:p>
       <w:pPr>
         <w:spacing w:before="0" w:after="40"/>
-      </w:pPr>
-      <w:r>
-        <w:rPr>
-          <w:rFonts w:ascii="Calibri" w:hAnsi="Calibri" w:eastAsia="宋体"/>
-          <w:sz w:val="21"/>
-        </w:rPr>
-        <w:t xml:space="preserve">filter 返回一个不含目标 id 的新数组，旧数组不会被挖掉元素；splice 会直接改变原数组。重新赋值给 todos 后，再保存和渲染，可以统一数据与页面。</w:t>
-      </w:r>
+        <w:rPr>
+          <w:rFonts w:ascii="Calibri" w:hAnsi="Calibri" w:eastAsia="宋体"/>
+          <w:sz w:val="21"/>
+        </w:rPr>
+      </w:pPr>
+      <w:r>
+        <w:rPr>
+          <w:rFonts w:ascii="Calibri" w:hAnsi="Calibri" w:eastAsia="宋体"/>
+          <w:sz w:val="21"/>
+        </w:rPr>
+        <w:t>filter 返回一个不含目标 id 的新数组，旧数组不会被挖掉元素；splice 会直接改变原数组。重新赋值给 todos 后，再保存和渲染，可以统一数据与页面。</w:t>
+      </w:r>
+    </w:p>
+    <w:p>
+      <w:pPr>
+        <w:spacing w:before="0" w:after="40"/>
+        <w:rPr>
+          <w:rFonts w:ascii="Calibri" w:hAnsi="Calibri" w:eastAsia="宋体"/>
+          <w:sz w:val="21"/>
+        </w:rPr>
+      </w:pPr>
     </w:p>
     <w:p>
       <w:pPr>
@@ -2304,14 +3676,27 @@
     <w:p>
       <w:pPr>
         <w:spacing w:before="0" w:after="40"/>
-      </w:pPr>
-      <w:r>
-        <w:rPr>
-          <w:rFonts w:ascii="Calibri" w:hAnsi="Calibri" w:eastAsia="宋体"/>
-          <w:sz w:val="21"/>
-        </w:rPr>
-        <w:t xml:space="preserve">依赖 load()：读取 localStorage 中 KEY 对应的 JSON，解析并校验为任务数组，交给 let todos = load()。随后首次 render 恢复页面；filter 则重新初始化为 all。</w:t>
-      </w:r>
+        <w:rPr>
+          <w:rFonts w:ascii="Calibri" w:hAnsi="Calibri" w:eastAsia="宋体"/>
+          <w:sz w:val="21"/>
+        </w:rPr>
+      </w:pPr>
+      <w:r>
+        <w:rPr>
+          <w:rFonts w:ascii="Calibri" w:hAnsi="Calibri" w:eastAsia="宋体"/>
+          <w:sz w:val="21"/>
+        </w:rPr>
+        <w:t>依赖 load()：读取 localStorage 中 KEY 对应的 JSON，解析并校验为任务数组，交给 let todos = load()。随后首次 render 恢复页面；filter 则重新初始化为 all。</w:t>
+      </w:r>
+    </w:p>
+    <w:p>
+      <w:pPr>
+        <w:spacing w:before="0" w:after="40"/>
+        <w:rPr>
+          <w:rFonts w:ascii="Calibri" w:hAnsi="Calibri" w:eastAsia="宋体"/>
+          <w:sz w:val="21"/>
+        </w:rPr>
+      </w:pPr>
     </w:p>
     <w:p>
       <w:pPr>
@@ -2357,7 +3742,7 @@
           <w:rFonts w:ascii="Calibri" w:hAnsi="Calibri" w:eastAsia="宋体"/>
           <w:sz w:val="21"/>
         </w:rPr>
-        <w:t xml:space="preserve">本次验证并修正了 render() 的焦点处理：初版 replaceChildren 后焦点落到 BODY，最终版在重建前记住任务 id，重建后聚焦新按钮。这样按 Enter 切换完成状态后，键盘操作不会失去当前位置。</w:t>
+        <w:t>本次验证并修正了 render() 的焦点处理：初版 replaceChildren 后焦点落到 BODY，最终版在重建前记住任务 id，重建后聚焦新按钮。这样按 Enter 切换完成状态后，键盘操作不会失去当前位置。</w:t>
       </w:r>
     </w:p>
     <w:p>
@@ -2439,7 +3824,7 @@
           <w:rFonts w:ascii="Calibri" w:hAnsi="Calibri" w:eastAsia="宋体"/>
           <w:sz w:val="21"/>
         </w:rPr>
-        <w:t xml:space="preserve">本次 AI 初版在正常数据下可运行，却遗漏了坏存储与整表重绘后的焦点问题；验收要同时检查状态数据、持久化失败路径和真实交互。</w:t>
+        <w:t>本次 AI 初版在正常数据下可运行，却遗漏了坏存储与整表重绘后的焦点问题；验收要同时检查状态数据、持久化失败路径和真实交互。</w:t>
       </w:r>
     </w:p>
     <w:p/>
@@ -15718,7 +17103,7 @@
 </file>
 
 <file path=customXml/item1.xml><?xml version="1.0" encoding="utf-8"?>
-<b:Sources xmlns:b="http://schemas.openxmlformats.org/officeDocument/2006/bibliography" xmlns="http://schemas.openxmlformats.org/officeDocument/2006/bibliography" SelectedStyle="/APA.XSL" StyleName="APA"/>
+<b:Sources xmlns:b="http://schemas.openxmlformats.org/officeDocument/2006/bibliography" xmlns="http://schemas.openxmlformats.org/officeDocument/2006/bibliography" StyleName="APA" SelectedStyle="/APA.XSL"/>
 </file>
 
 <file path=customXml/itemProps1.xml><?xml version="1.0" encoding="utf-8"?>

</xml_diff>